<commit_message>
Restructure Korea world book around Korea-specific themes
Add school/exams, gender/military service, housing/class, religion
and Jeolla region + Gwangju local; fold alone-time and housing into
housing/class; rename pressure to work/comparison; add vent mechanism
and shared memories to core. Spec now uses common core + country themes.

Co-Authored-By: Claude Opus 5.5 <noreply@anthropic.com>
Claude-Session: https://claude.ai/code/session_01BkUHvVtkxEBBCip6XRXoJu
</commit_message>
<xml_diff>
--- a/worldbook/韩国背景世界书by鲷鱼烧.docx
+++ b/worldbook/韩国背景世界书by鲷鱼烧.docx
@@ -9,7 +9,7 @@
     </w:p>
     <w:p>
       <w:r>
-        <w:t>共 18 个文件 · 生成于 2026-10-10</w:t>
+        <w:t>共 22 个文件 · 生成于 2026-10-10</w:t>
       </w:r>
     </w:p>
     <w:p>
@@ -49,72 +49,92 @@
     </w:p>
     <w:p>
       <w:r>
-        <w:t>5. 韩国社会环境地区差异——地方小城镇篇 by鲷鱼烧.docx　（第二层 · 选一）</w:t>
-      </w:r>
-    </w:p>
-    <w:p>
-      <w:r>
-        <w:t>6. 韩国——约会与恋爱篇by鲷鱼烧.docx　（第三层 · 按需）</w:t>
-      </w:r>
-    </w:p>
-    <w:p>
-      <w:r>
-        <w:t>7. 韩国——社会压力篇by鲷鱼烧.docx　（第三层 · 按需）</w:t>
-      </w:r>
-    </w:p>
-    <w:p>
-      <w:r>
-        <w:t>8. 韩国——身体与日常节律篇by鲷鱼烧.docx　（第三层 · 建议常驻）</w:t>
-      </w:r>
-    </w:p>
-    <w:p>
-      <w:r>
-        <w:t>9. 韩国——金钱观篇by鲷鱼烧.docx　（第三层 · 按需）</w:t>
-      </w:r>
-    </w:p>
-    <w:p>
-      <w:r>
-        <w:t>10. 韩国——流行文化与娱乐篇by鲷鱼烧.docx　（第三层 · 按需）</w:t>
-      </w:r>
-    </w:p>
-    <w:p>
-      <w:r>
-        <w:t>11. 韩国——家庭与出身篇by鲷鱼烧.docx　（第三层 · 建议常驻）</w:t>
-      </w:r>
-    </w:p>
-    <w:p>
-      <w:r>
-        <w:t>12. 韩国——独处时间篇by鲷鱼烧.docx　（第三层 · 按需）</w:t>
-      </w:r>
-    </w:p>
-    <w:p>
-      <w:r>
-        <w:t>13. 韩国——住处篇by鲷鱼烧.docx　（第三层 · 按需）</w:t>
-      </w:r>
-    </w:p>
-    <w:p>
-      <w:r>
-        <w:t>14. 韩国——非标准路径篇by鲷鱼烧.docx　（第三层 · 非正规职时常驻）</w:t>
-      </w:r>
-    </w:p>
-    <w:p>
-      <w:r>
-        <w:t>15. 韩国——少数身份篇by鲷鱼烧.docx　（第三层 · 相关身份时常驻）</w:t>
-      </w:r>
-    </w:p>
-    <w:p>
-      <w:r>
-        <w:t>16. 首尔本地地名、说话方式、饮食文化by鲷鱼烧.docx　（第四层 · 首尔）</w:t>
-      </w:r>
-    </w:p>
-    <w:p>
-      <w:r>
-        <w:t>17. 釜山本地地名、说话方式、饮食文化by鲷鱼烧.docx　（第四层 · 釜山）</w:t>
-      </w:r>
-    </w:p>
-    <w:p>
-      <w:r>
-        <w:t>18. 附件：韩中双语输出时遵循原本语义by鲷鱼烧.docx　（附件 · 双语输出时常驻）</w:t>
+        <w:t>5. 韩国社会环境地区差异——全罗道篇 by鲷鱼烧.docx　（第二层 · 选一）</w:t>
+      </w:r>
+    </w:p>
+    <w:p>
+      <w:r>
+        <w:t>6. 韩国社会环境地区差异——地方小城镇篇 by鲷鱼烧.docx　（第二层 · 选一）</w:t>
+      </w:r>
+    </w:p>
+    <w:p>
+      <w:r>
+        <w:t>7. 韩国——约会与恋爱篇by鲷鱼烧.docx　（第三层 · 按需）</w:t>
+      </w:r>
+    </w:p>
+    <w:p>
+      <w:r>
+        <w:t>8. 韩国——职场与比较篇by鲷鱼烧.docx　（第三层 · 按需）</w:t>
+      </w:r>
+    </w:p>
+    <w:p>
+      <w:r>
+        <w:t>9. 韩国——学历与入试篇by鲷鱼烧.docx　（第三层 · 建议常驻）</w:t>
+      </w:r>
+    </w:p>
+    <w:p>
+      <w:r>
+        <w:t>10. 韩国——性别与兵役篇by鲷鱼烧.docx　（第三层 · 按需）</w:t>
+      </w:r>
+    </w:p>
+    <w:p>
+      <w:r>
+        <w:t>11. 韩国——身体与日常节律篇by鲷鱼烧.docx　（第三层 · 建议常驻）</w:t>
+      </w:r>
+    </w:p>
+    <w:p>
+      <w:r>
+        <w:t>12. 韩国——金钱观篇by鲷鱼烧.docx　（第三层 · 按需）</w:t>
+      </w:r>
+    </w:p>
+    <w:p>
+      <w:r>
+        <w:t>13. 韩国——房子与阶层篇by鲷鱼烧.docx　（第三层 · 按需）</w:t>
+      </w:r>
+    </w:p>
+    <w:p>
+      <w:r>
+        <w:t>14. 韩国——流行文化与娱乐篇by鲷鱼烧.docx　（第三层 · 按需）</w:t>
+      </w:r>
+    </w:p>
+    <w:p>
+      <w:r>
+        <w:t>15. 韩国——家庭与出身篇by鲷鱼烧.docx　（第三层 · 建议常驻）</w:t>
+      </w:r>
+    </w:p>
+    <w:p>
+      <w:r>
+        <w:t>16. 韩国——宗教与信仰篇by鲷鱼烧.docx　（第三层 · 信教时常驻）</w:t>
+      </w:r>
+    </w:p>
+    <w:p>
+      <w:r>
+        <w:t>17. 韩国——非标准路径篇by鲷鱼烧.docx　（第三层 · 非正规职时常驻）</w:t>
+      </w:r>
+    </w:p>
+    <w:p>
+      <w:r>
+        <w:t>18. 韩国——少数身份篇by鲷鱼烧.docx　（第三层 · 相关身份时常驻）</w:t>
+      </w:r>
+    </w:p>
+    <w:p>
+      <w:r>
+        <w:t>19. 首尔本地地名、说话方式、饮食文化by鲷鱼烧.docx　（第四层 · 首尔）</w:t>
+      </w:r>
+    </w:p>
+    <w:p>
+      <w:r>
+        <w:t>20. 釜山本地地名、说话方式、饮食文化by鲷鱼烧.docx　（第四层 · 釜山）</w:t>
+      </w:r>
+    </w:p>
+    <w:p>
+      <w:r>
+        <w:t>21. 光州本地地名、说话方式、饮食文化by鲷鱼烧.docx　（第四层 · 光州全罗道）</w:t>
+      </w:r>
+    </w:p>
+    <w:p>
+      <w:r>
+        <w:t>22. 附件：韩中双语输出时遵循原本语义by鲷鱼烧.docx　（附件 · 双语输出时常驻）</w:t>
       </w:r>
     </w:p>
     <w:p/>
@@ -152,7 +172,7 @@
     </w:p>
     <w:p>
       <w:r>
-        <w:t>→ 所有韩国角色都用，建议设为常驻（SillyTavern：蓝灯／Constant）。包含核心规则和"回复前自检"。</w:t>
+        <w:t>→ 所有韩国角色都用，建议设为常驻（SillyTavern：蓝灯／Constant）。包含核心规则（落地、写看得见的、憋和爆）、共同的记忆和"回复前自检"。</w:t>
       </w:r>
     </w:p>
     <w:p/>
@@ -173,6 +193,11 @@
     </w:p>
     <w:p>
       <w:r>
+        <w:t>- 全罗道篇 &lt;kr_region_jeolla&gt;：5·18和光州、被贴标签的经验、政治、2026年光州全南合并、人在流走、吃、起亚老虎。</w:t>
+      </w:r>
+    </w:p>
+    <w:p>
+      <w:r>
         <w:t>- 地方小城镇篇 &lt;kr_region_local&gt;：被认识、人在流走、开车生活、名节回老家、土地。</w:t>
       </w:r>
     </w:p>
@@ -184,6 +209,11 @@
     </w:p>
     <w:p>
       <w:r>
+        <w:t>共通主题（各国都有）：</w:t>
+      </w:r>
+    </w:p>
+    <w:p>
+      <w:r>
         <w:t>- 约会与恋爱 &lt;kr_theme_love&gt;：썸、告白、纪念日、约会费用、不恋爱的年轻人、结婚门槛。</w:t>
       </w:r>
     </w:p>
@@ -194,16 +224,6 @@
     </w:p>
     <w:p>
       <w:r>
-        <w:t>- 社会压力 &lt;kr_theme_pressure&gt;：补习和修能、求职、职场、兵役、结婚和比较、政治气氛。</w:t>
-      </w:r>
-    </w:p>
-    <w:p>
-      <w:r>
-        <w:t xml:space="preserve">  触发词参考：회사、야근、팀장、취업、면접、수능、군대、결혼</w:t>
-      </w:r>
-    </w:p>
-    <w:p>
-      <w:r>
         <w:t>- 身体与日常节律 &lt;kr_theme_body&gt;：外貌管理、真实饮食、酒和宿醉、睡眠、看病、季节和雾霾。</w:t>
       </w:r>
     </w:p>
@@ -214,12 +234,12 @@
     </w:p>
     <w:p>
       <w:r>
-        <w:t>- 金钱观 &lt;kr_theme_money&gt;：2026年物价和工资、月租和全租、房价、股票和储蓄、请客和AA、月节奏。</w:t>
-      </w:r>
-    </w:p>
-    <w:p>
-      <w:r>
-        <w:t xml:space="preserve">  触发词参考：돈、월급、월세、전세、비싸、주식</w:t>
+        <w:t>- 金钱观 &lt;kr_theme_money&gt;：2026年物价和工资、股票和储蓄、请客和AA、月节奏。</w:t>
+      </w:r>
+    </w:p>
+    <w:p>
+      <w:r>
+        <w:t xml:space="preserve">  触发词参考：돈、월급、비싸、주식、카페</w:t>
       </w:r>
     </w:p>
     <w:p>
@@ -244,26 +264,6 @@
     </w:p>
     <w:p>
       <w:r>
-        <w:t>- 独处时间 &lt;kr_theme_alone&gt;：혼밥혼술、房间里的声音、深夜、孤独。</w:t>
-      </w:r>
-    </w:p>
-    <w:p>
-      <w:r>
-        <w:t xml:space="preserve">  触发词参考：혼자、집、밤、외로워</w:t>
-      </w:r>
-    </w:p>
-    <w:p>
-      <w:r>
-        <w:t>- 住处 &lt;kr_theme_home&gt;：单间、考试院、半地下、全租和月租、层间噪音。</w:t>
-      </w:r>
-    </w:p>
-    <w:p>
-      <w:r>
-        <w:t xml:space="preserve">  触发词参考：방、집、이사、월세、전세、고시원</w:t>
-      </w:r>
-    </w:p>
-    <w:p>
-      <w:r>
         <w:t>- 非标准路径 &lt;kr_theme_path&gt;："休息中"的年轻人、打工、N잡、备考、复读。</w:t>
       </w:r>
     </w:p>
@@ -282,6 +282,61 @@
         <w:t xml:space="preserve">  角色有相关身份时常驻。</w:t>
       </w:r>
     </w:p>
+    <w:p>
+      <w:r>
+        <w:t>韩国特有主题：</w:t>
+      </w:r>
+    </w:p>
+    <w:p>
+      <w:r>
+        <w:t>- 职场与比较 &lt;kr_theme_work&gt;：求职、职场上下级、聚餐、跳槽、比较和结婚时间线。</w:t>
+      </w:r>
+    </w:p>
+    <w:p>
+      <w:r>
+        <w:t xml:space="preserve">  触发词参考：회사、야근、팀장、취업、면접、결혼</w:t>
+      </w:r>
+    </w:p>
+    <w:p>
+      <w:r>
+        <w:t>- 学历与入试 &lt;kr_theme_school&gt;：补习赛道、修能、复读、学阀、大学生活。</w:t>
+      </w:r>
+    </w:p>
+    <w:p>
+      <w:r>
+        <w:t xml:space="preserve">  学生角色常驻；成年角色也建议常驻（学历会被一直问）。触发词参考：수능、학원、대학、재수、학교</w:t>
+      </w:r>
+    </w:p>
+    <w:p>
+      <w:r>
+        <w:t>- 性别与兵役 &lt;kr_theme_gender&gt;：兵役18个月、性别对立、工资差距和安全、恋爱里的性别话题。</w:t>
+      </w:r>
+    </w:p>
+    <w:p>
+      <w:r>
+        <w:t xml:space="preserve">  男性角色、或剧情涉及恋爱和职场时建议常驻。触发词参考：군대、입대、전역、페미、젠더</w:t>
+      </w:r>
+    </w:p>
+    <w:p>
+      <w:r>
+        <w:t>- 房子与阶层 &lt;kr_theme_house&gt;：公寓＝阶层、申购、单间考试院半地下、全租和月租、一个人在房间里。</w:t>
+      </w:r>
+    </w:p>
+    <w:p>
+      <w:r>
+        <w:t xml:space="preserve">  触发词参考：집、방、아파트、월세、전세、이사、혼자</w:t>
+      </w:r>
+    </w:p>
+    <w:p>
+      <w:r>
+        <w:t>- 宗教与信仰 &lt;kr_theme_religion&gt;：教会社交网络、异端、寺院寄宿、算命塔罗。</w:t>
+      </w:r>
+    </w:p>
+    <w:p>
+      <w:r>
+        <w:t xml:space="preserve">  角色或家人信教时常驻；触发词参考：교회、절、기도、사주、타로</w:t>
+      </w:r>
+    </w:p>
     <w:p/>
     <w:p>
       <w:r>
@@ -298,6 +353,11 @@
         <w:t>- 釜山本地 &lt;kr_local_busan&gt;：地方、吃、釜山方言对照（重点：〜나和〜노的区别）、乐天巨人。</w:t>
       </w:r>
     </w:p>
+    <w:p>
+      <w:r>
+        <w:t>- 光州本地 &lt;kr_local_gwangju&gt;：光州和全罗道的地方、南道饮食、全罗道方言对照（〜잉、〜당께、거시기、〜부러）。</w:t>
+      </w:r>
+    </w:p>
     <w:p/>
     <w:p>
       <w:r>
@@ -312,6 +372,17 @@
     <w:p/>
     <w:p>
       <w:r>
+        <w:t>【为什么和日本版的分类不一样】</w:t>
+      </w:r>
+    </w:p>
+    <w:p>
+      <w:r>
+        <w:t>日本版的分类是按"什么在深刻地塑造日本人"选的。韩国版保留了各国共通的主题，把塑造韩国人更深的几股力量单独成篇：学历和入试、性别和兵役、房子和阶层、宗教；"社会压力"改成"职场与比较"；"独处时间"和"住处"并进"房子与阶层"；地区层加入全罗道。</w:t>
+      </w:r>
+    </w:p>
+    <w:p/>
+    <w:p>
+      <w:r>
         <w:t>【插入顺序建议】</w:t>
       </w:r>
     </w:p>
@@ -353,7 +424,12 @@
     </w:p>
     <w:p>
       <w:r>
-        <w:t>- 独有的压力：修能、兵役、全租和房价、"休息中"的年轻人。</w:t>
+        <w:t>- 表达方式：日本的压力从缝里漏出来；韩国更常见的是先憋住，再在酒桌、私聊或家里爆出来。</w:t>
+      </w:r>
+    </w:p>
+    <w:p>
+      <w:r>
+        <w:t>- 独有的压力：修能和学阀、兵役和性别对立、公寓和阶层、"休息中"的年轻人。</w:t>
       </w:r>
     </w:p>
     <w:p/>
@@ -426,7 +502,7 @@
     </w:p>
     <w:p>
       <w:r>
-        <w:t>3. 话和心分开：韩国人的情绪相对外露，会抱怨、会发火、会在朋友面前哭；但对上级、长辈和不熟的人，真心话会被吞下去，改在酒桌、KakaoTalk私聊或背后吐槽里出来。写出"在谁面前说什么"的区别。</w:t>
+        <w:t>3. 憋和爆：韩国人的情绪相对外露，但对上级、长辈和不熟的人，不满会先被憋住。憋住的东西不会消失，而是换个地方出来：酒桌上骂、KakaoTalk私聊里吐槽、回家对家人发火、某天在小事上突然爆发。长期憋着会被说成「화병」（憋出来的病）。写出"在谁面前憋、在谁面前爆"的区别，以及爆发时的导火索往往是一件小事。</w:t>
       </w:r>
     </w:p>
     <w:p>
@@ -610,7 +686,18 @@
     <w:p/>
     <w:p>
       <w:r>
-        <w:t>【回复前自检】有没有一个外部条件影响了角色？有没有用动作代替形容词？在谁面前说什么，有没有区别？</w:t>
+        <w:t>【共同的记忆】</w:t>
+      </w:r>
+    </w:p>
+    <w:p>
+      <w:r>
+        <w:t>二三十岁的韩国人共同经历过几件大事，提起时语气会变：2014年世越号沉船（同龄的高中生遇难，黄丝带）、2022年梨泰院踩踏事故、2024年12月的戒严之夜（很多人熬夜看直播、冲去国会）和之后的总统罢免与提前大选。角色对政治可以热心、冷漠或厌倦，但不会完全不知道这些事。</w:t>
+      </w:r>
+    </w:p>
+    <w:p/>
+    <w:p>
+      <w:r>
+        <w:t>【回复前自检】有没有一个外部条件影响了角色？有没有用动作代替形容词？在谁面前憋、在谁面前爆，有没有区别？</w:t>
       </w:r>
     </w:p>
     <w:p>
@@ -920,6 +1007,176 @@
     <w:p/>
     <w:p>
       <w:r>
+        <w:t>═════ 韩国社会环境地区差异——全罗道篇 by鲷鱼烧.docx ═════</w:t>
+      </w:r>
+    </w:p>
+    <w:p>
+      <w:r>
+        <w:t>&lt;kr_region_jeolla&gt;</w:t>
+      </w:r>
+    </w:p>
+    <w:p>
+      <w:r>
+        <w:t>用途：角色在全罗道（湖南：光州、全南、全北；全州、丽水、顺天、木浦等）时，叠加在 &lt;kr_core&gt; 之上。这里的人带着一段共同的历史记忆、一种被外界贴标签的经验，以及全国公认的好饭菜。</w:t>
+      </w:r>
+    </w:p>
+    <w:p/>
+    <w:p>
+      <w:r>
+        <w:t>【五月的城市】</w:t>
+      </w:r>
+    </w:p>
+    <w:p>
+      <w:r>
+        <w:t>- 1980年5月的光州民主化运动（5·18）是光州人的集体记忆。每年5月18日在旧全南道厅前的5·18民主广场举行纪念式。很多家庭有当年的亲历者，老人提起时会沉默，或者突然说很多。</w:t>
+      </w:r>
+    </w:p>
+    <w:p>
+      <w:r>
+        <w:t>- 2024年小说家韩江（光州出生）获诺贝尔文学奖，她写5·18的小说《少年来了》让更多年轻人重读这段历史。光州人把这当作骄傲。</w:t>
+      </w:r>
+    </w:p>
+    <w:p>
+      <w:r>
+        <w:t>- 2024年12月的戒严之夜，很多光州人第一反应是联想到1980年5月。</w:t>
+      </w:r>
+    </w:p>
+    <w:p>
+      <w:r>
+        <w:t>- 写法：光州角色对军队、戒严、"暴徒"这类词会有比别人更强的反应。这种反应用一个动作写出来，不做历史讲解。</w:t>
+      </w:r>
+    </w:p>
+    <w:p/>
+    <w:p>
+      <w:r>
+        <w:t>【被贴标签的经验】</w:t>
+      </w:r>
+    </w:p>
+    <w:p>
+      <w:r>
+        <w:t>- 岭南和湖南之间的地域情结（지역감정）来自几十年的政治对立和开发不均。到今天，多数时候以玩笑的形式出现，但在网上和一些职场里，仍有针对全罗道人的刻板印象和蔑称。</w:t>
+      </w:r>
+    </w:p>
+    <w:p>
+      <w:r>
+        <w:t>- 有的全罗道出身者到首尔后会刻意改掉口音，不主动说老家在哪；有的人反而更骄傲地说方言。</w:t>
+      </w:r>
+    </w:p>
+    <w:p>
+      <w:r>
+        <w:t>- 写法：被问「고향이 어디예요?」时，全罗道角色回答前的那一下停顿，或者特意抢先说「전라도요」的那种坦然，都是性格信息。</w:t>
+      </w:r>
+    </w:p>
+    <w:p/>
+    <w:p>
+      <w:r>
+        <w:t>【政治】湖南是共同民主党的票仓：2025年大选李在明在光州得票约八成五，投票率全国最高。当地人会说「여그는 파란색이제」（这里是蓝色的嘛）。不支持民主党的光州人反而是少数，会在家庭聚会上保持沉默。</w:t>
+      </w:r>
+    </w:p>
+    <w:p/>
+    <w:p>
+      <w:r>
+        <w:t>【2026年的变化】2026年7月起，光州广域市和全罗南道合并为一个特别市（전남광주통합특별시）。市名、市政府放在哪里、各地谁得到什么，是当地人每天都会聊的话题。</w:t>
+      </w:r>
+    </w:p>
+    <w:p/>
+    <w:p>
+      <w:r>
+        <w:t>【人在流走】</w:t>
+      </w:r>
+    </w:p>
+    <w:p>
+      <w:r>
+        <w:t>- 全南和全北的人口都在减少，各约一百七八十万。年轻人去首尔或光州，农村和渔村越来越老，学校停办。</w:t>
+      </w:r>
+    </w:p>
+    <w:p>
+      <w:r>
+        <w:t>- 光州有汽车工厂（生产小型车캐스퍼）和推进中的AI产业；罗州有能源大学；全北有新万金开发区，但"地方没有好工作"仍是年轻人离开的主要原因。</w:t>
+      </w:r>
+    </w:p>
+    <w:p/>
+    <w:p>
+      <w:r>
+        <w:t>【城市各有面孔】</w:t>
+      </w:r>
+    </w:p>
+    <w:p>
+      <w:r>
+        <w:t>- 光州：湖南最大的城市，有大学、商场、无等山。</w:t>
+      </w:r>
+    </w:p>
+    <w:p>
+      <w:r>
+        <w:t>- 全州：韩屋村、拌饭、全北的文化中心，节奏慢。</w:t>
+      </w:r>
+    </w:p>
+    <w:p>
+      <w:r>
+        <w:t>- 丽水：海、夜景，「여수 밤바다」是一首歌，也是一种浪漫的想象。</w:t>
+      </w:r>
+    </w:p>
+    <w:p>
+      <w:r>
+        <w:t>- 顺天：顺天湾湿地、国家庭园，"生态之都"。</w:t>
+      </w:r>
+    </w:p>
+    <w:p>
+      <w:r>
+        <w:t>- 木浦：港口、近代街区、斑鳐和小章鱼。</w:t>
+      </w:r>
+    </w:p>
+    <w:p/>
+    <w:p>
+      <w:r>
+        <w:t>【吃：全国公认】</w:t>
+      </w:r>
+    </w:p>
+    <w:p>
+      <w:r>
+        <w:t>- 「전라도는 어디 가도 맛있다」：去任何一家饭店，小菜都摆满一桌。好吃会说「개미가 있다」（有滋味）。</w:t>
+      </w:r>
+    </w:p>
+    <w:p>
+      <w:r>
+        <w:t>- 写法：全罗道角色去首尔吃饭，会嫌小菜少、味道淡；家里寄来的泡菜和咸菜是他的骄傲。</w:t>
+      </w:r>
+    </w:p>
+    <w:p/>
+    <w:p>
+      <w:r>
+        <w:t>【方言＝身份】</w:t>
+      </w:r>
+    </w:p>
+    <w:p>
+      <w:r>
+        <w:t>- 全罗道方言（详见 &lt;kr_local_gwangju&gt;）在媒体里常被安排给黑帮和喜剧角色，所以有人觉得它"土"或"凶"；近年也有严肃作品让它变得有分量。</w:t>
+      </w:r>
+    </w:p>
+    <w:p>
+      <w:r>
+        <w:t>- 在首尔工作的人会切换成标准语，给家里打电话时一秒切回方言。</w:t>
+      </w:r>
+    </w:p>
+    <w:p>
+      <w:r>
+        <w:t>- 写法：酒后、生气、和发小说话时方言会回来。</w:t>
+      </w:r>
+    </w:p>
+    <w:p/>
+    <w:p>
+      <w:r>
+        <w:t>【起亚老虎】光州人几乎都是起亚老虎（KIA 타이거즈）的球迷，前身是海太老虎。2024年拿下韩国大赛冠军，主场是光州起亚冠军球场。「무등산 호랑이」是光州人的自称之一。</w:t>
+      </w:r>
+    </w:p>
+    <w:p>
+      <w:r>
+        <w:t>&lt;/kr_region_jeolla&gt;</w:t>
+      </w:r>
+    </w:p>
+    <w:p/>
+    <w:p>
+      <w:r>
         <w:t>═════ 韩国社会环境地区差异——地方小城镇篇 by鲷鱼烧.docx ═════</w:t>
       </w:r>
     </w:p>
@@ -1209,17 +1466,17 @@
     <w:p/>
     <w:p>
       <w:r>
-        <w:t>═════ 韩国——社会压力篇by鲷鱼烧.docx ═════</w:t>
-      </w:r>
-    </w:p>
-    <w:p>
-      <w:r>
-        <w:t>&lt;kr_theme_pressure&gt;</w:t>
-      </w:r>
-    </w:p>
-    <w:p>
-      <w:r>
-        <w:t>用途：角色身上有学业、求职、职场、兵役或结婚压力时使用。韩国的压力很外露，常以比较的形式出现：分数、学校、公司、年薪、房子，都可以被直接问到、被拿来排名。</w:t>
+        <w:t>═════ 韩国——职场与比较篇by鲷鱼烧.docx ═════</w:t>
+      </w:r>
+    </w:p>
+    <w:p>
+      <w:r>
+        <w:t>&lt;kr_theme_work&gt;</w:t>
+      </w:r>
+    </w:p>
+    <w:p>
+      <w:r>
+        <w:t>用途：角色身上有求职、职场或"被比较"的压力时使用。学业见 &lt;kr_theme_school&gt;，兵役见 &lt;kr_theme_gender&gt;。韩国的压力很外露，常以比较的形式出现：分数、学校、公司、年薪、房子，都可以被直接问到、被拿来排名。</w:t>
       </w:r>
     </w:p>
     <w:p/>
@@ -1241,94 +1498,285 @@
     <w:p/>
     <w:p>
       <w:r>
-        <w:t>【学业：从小开始的竞争】</w:t>
-      </w:r>
-    </w:p>
-    <w:p>
-      <w:r>
-        <w:t>- 补习班（학원）从小学开始，课外辅导费连年创新高，高中生每月平均近80万韩元。大峙洞是补习班一条街的代名词。</w:t>
-      </w:r>
-    </w:p>
-    <w:p>
-      <w:r>
-        <w:t>- 修能（高考）是一年一度的全国大事：考试当天飞机停飞、公司推迟上班、警车送迟到的考生。</w:t>
-      </w:r>
-    </w:p>
-    <w:p>
-      <w:r>
-        <w:t>- 复读（재수、N수）很常见，2027学年复读生比例创新高。</w:t>
-      </w:r>
-    </w:p>
-    <w:p>
-      <w:r>
-        <w:t>- "인서울"（考进首尔的大学）、"SKY"（首尔大、高丽大、延世大）是目标和标签。</w:t>
-      </w:r>
-    </w:p>
-    <w:p>
-      <w:r>
-        <w:t>- 写法：角色的学校和专业会被问，也会被拿来判断他是什么人。</w:t>
+        <w:t>【求职：취준생】</w:t>
+      </w:r>
+    </w:p>
+    <w:p>
+      <w:r>
+        <w:t>- 취준생（求职准备生）：准备托业分数、资格证、实习、简历（자소서）、面试。很多人毕业后准备一两年。</w:t>
+      </w:r>
+    </w:p>
+    <w:p>
+      <w:r>
+        <w:t>- 2026年青年就业很难：青年就业率连续下滑，"什么都不做、只是在休息"（쉬었음）的年轻人有几十万。</w:t>
+      </w:r>
+    </w:p>
+    <w:p>
+      <w:r>
+        <w:t>- 公务员考试曾经是"铁饭碗"的首选，竞争率比以前低，但仍然有很多人在考试村（鹭梁津）备考。</w:t>
+      </w:r>
+    </w:p>
+    <w:p>
+      <w:r>
+        <w:t>- 大企业和中小企业的起薪差距很大（大企业约是中小企业的1.5倍），所以很多人宁可多准备一年也要进大企业。</w:t>
       </w:r>
     </w:p>
     <w:p/>
     <w:p>
       <w:r>
-        <w:t>【求职：준비생】</w:t>
-      </w:r>
-    </w:p>
-    <w:p>
-      <w:r>
-        <w:t>- 취준생（求职准备生）：准备托业分数、资格证、实习、简历（자소서）、面试。很多人毕业后准备一两年。</w:t>
-      </w:r>
-    </w:p>
-    <w:p>
-      <w:r>
-        <w:t>- 2026年青年就业很难：青年就业率连续下滑，"什么都不做、只是在休息"（쉬었음）的年轻人有几十万。</w:t>
-      </w:r>
-    </w:p>
-    <w:p>
-      <w:r>
-        <w:t>- 公务员考试曾经是"铁饭碗"的首选，竞争率比以前低，但仍然有很多人在考试村（鹭梁津）备考。</w:t>
-      </w:r>
-    </w:p>
-    <w:p>
-      <w:r>
-        <w:t>- 大企业和中小企业的起薪差距很大（大企业约是中小企业的1.5倍），所以很多人宁可多准备一年也要进大企业。</w:t>
+        <w:t>【职场】</w:t>
+      </w:r>
+    </w:p>
+    <w:p>
+      <w:r>
+        <w:t>- 上下级明确：组长、科长、代理、主任、社员，各有称呼。</w:t>
+      </w:r>
+    </w:p>
+    <w:p>
+      <w:r>
+        <w:t>- 加班和"看眼色下班"仍然存在，但比以前少。2026年政府在推4.5天工作制的试点。</w:t>
+      </w:r>
+    </w:p>
+    <w:p>
+      <w:r>
+        <w:t>- 聚餐（회식）：变少、变短了，有的公司改成午餐聚餐，但"不去会被记住"的感觉还在。</w:t>
+      </w:r>
+    </w:p>
+    <w:p>
+      <w:r>
+        <w:t>- 跳槽和提前离职很常见，同时做几份工作的人（N잡러）创新高。</w:t>
+      </w:r>
+    </w:p>
+    <w:p>
+      <w:r>
+        <w:t>- 写法：上级的一句「잠깐 얘기 좀 할까?」能让角色整个下午不安。</w:t>
       </w:r>
     </w:p>
     <w:p/>
     <w:p>
       <w:r>
-        <w:t>【职场】</w:t>
-      </w:r>
-    </w:p>
-    <w:p>
-      <w:r>
-        <w:t>- 上下级明确：组长、科长、代理、主任、社员，各有称呼。</w:t>
-      </w:r>
-    </w:p>
-    <w:p>
-      <w:r>
-        <w:t>- 加班和"看眼色下班"仍然存在，但比以前少。2026年政府在推4.5天工作制的试点。</w:t>
-      </w:r>
-    </w:p>
-    <w:p>
-      <w:r>
-        <w:t>- 聚餐（회식）：变少、变短了，有的公司改成午餐聚餐，但"不去会被记住"的感觉还在。</w:t>
-      </w:r>
-    </w:p>
-    <w:p>
-      <w:r>
-        <w:t>- 跳槽和提前离职很常见，同时做几份工作的人（N잡러）创新高。</w:t>
-      </w:r>
-    </w:p>
-    <w:p>
-      <w:r>
-        <w:t>- 写法：上级的一句「잠깐 얘기 좀 할까?」能让角色整个下午不安。</w:t>
+        <w:t>【比较和结婚时间线】</w:t>
+      </w:r>
+    </w:p>
+    <w:p>
+      <w:r>
+        <w:t>- 名节回家时亲戚的问题：「취업은?」「결혼은?」「애는?」「집은?」。</w:t>
+      </w:r>
+    </w:p>
+    <w:p>
+      <w:r>
+        <w:t>- 朋友的婚礼、Instagram上的新房、同学的年薪：比较无处不在。</w:t>
+      </w:r>
+    </w:p>
+    <w:p>
+      <w:r>
+        <w:t>- 「N포세대」：放弃恋爱、结婚、生育、买房……的一代，这是年轻人自嘲时常用的词。</w:t>
+      </w:r>
+    </w:p>
+    <w:p>
+      <w:r>
+        <w:t>- 写法：角色在婚礼上随份子（축의금）时会算该给多少：关系一般5万，熟人10万，参加婚宴要给得更多。</w:t>
       </w:r>
     </w:p>
     <w:p/>
     <w:p>
       <w:r>
+        <w:t>【差异】完全适应竞争的人、表面努力私下很累的人、选择退出竞争的人、在一件事上拒绝（不考公、不结婚、不进大企业）并以此定义自己的人，可以在同一间屋子里。</w:t>
+      </w:r>
+    </w:p>
+    <w:p>
+      <w:r>
+        <w:t>&lt;/kr_theme_work&gt;</w:t>
+      </w:r>
+    </w:p>
+    <w:p/>
+    <w:p>
+      <w:r>
+        <w:t>═════ 韩国——学历与入试篇by鲷鱼烧.docx ═════</w:t>
+      </w:r>
+    </w:p>
+    <w:p>
+      <w:r>
+        <w:t>&lt;kr_theme_school&gt;</w:t>
+      </w:r>
+    </w:p>
+    <w:p>
+      <w:r>
+        <w:t>用途：写角色的学生时代，以及学历如何一直跟着他。在韩国，考上哪所大学不只是人生的一个阶段，而是一个人身份的底色，三十岁时还会被问到。</w:t>
+      </w:r>
+    </w:p>
+    <w:p/>
+    <w:p>
+      <w:r>
+        <w:t>【写法总则】</w:t>
+      </w:r>
+    </w:p>
+    <w:p>
+      <w:r>
+        <w:t>- 给角色三个具体信息：高中是哪种（一般高中、特目高、自私高、地方高中）、修能考了几次、最后上了哪所大学哪个专业（或者没上）。</w:t>
+      </w:r>
+    </w:p>
+    <w:p>
+      <w:r>
+        <w:t>- 学历在场景里的出现方式：初次见面被问「어디 학교 나왔어요?」、简历上的一行、同学聚会上的座次、父母在亲戚面前提不提。</w:t>
+      </w:r>
+    </w:p>
+    <w:p/>
+    <w:p>
+      <w:r>
+        <w:t>【从小开始的赛道】</w:t>
+      </w:r>
+    </w:p>
+    <w:p>
+      <w:r>
+        <w:t>- 补习班（학원）从幼儿园就开始：英语幼儿园、数学、论述。大峙洞是补习班一条街的代名词。孩子在几个补习班之间连轴转（학원 뺑뺑이），晚上十点下课由家长开车接。</w:t>
+      </w:r>
+    </w:p>
+    <w:p>
+      <w:r>
+        <w:t>- 课外辅导费连年处于高位，高中生每月平均近80万韩元，是很多家庭最大的开销。</w:t>
+      </w:r>
+    </w:p>
+    <w:p>
+      <w:r>
+        <w:t>- 幼儿英语学校的入学考试被叫作「7세 고시」（七岁高考），2026年10月起法律禁止对幼儿进行入学考试。</w:t>
+      </w:r>
+    </w:p>
+    <w:p/>
+    <w:p>
+      <w:r>
+        <w:t>【修能：全国性的一天】</w:t>
+      </w:r>
+    </w:p>
+    <w:p>
+      <w:r>
+        <w:t>- 每年11月的修能考试日：飞机在听力时间停飞、公司推迟上班、后辈在考场外列队加油、警车送迟到的考生。考完那天晚上，考生会发朋友圈或者关掉手机。</w:t>
+      </w:r>
+    </w:p>
+    <w:p>
+      <w:r>
+        <w:t>- 大学录取八成是随时（看高中成绩和活动），约两成是定时（看修能分数）；首尔主要大学的定时比例更高。</w:t>
+      </w:r>
+    </w:p>
+    <w:p>
+      <w:r>
+        <w:t>- 2026学年起，校园暴力的处分记录会影响所有大学的录取，有记录的考生大多落榜。这让"学暴"成了更沉重的话题。</w:t>
+      </w:r>
+    </w:p>
+    <w:p>
+      <w:r>
+        <w:t>- 2028学年起高考和高中成绩制度改革，在校的高中生常抱怨自己是"实验品"。</w:t>
+      </w:r>
+    </w:p>
+    <w:p/>
+    <w:p>
+      <w:r>
+        <w:t>【复读：N수】</w:t>
+      </w:r>
+    </w:p>
+    <w:p>
+      <w:r>
+        <w:t>- 复读（재수、삼수、N수）非常常见：2027学年修能报名者里，毕业生超过三分之一，二十多年来最多。医学院扩招（向地方医学院的"地区医生"名额倾斜）让很多人再考一次。</w:t>
+      </w:r>
+    </w:p>
+    <w:p>
+      <w:r>
+        <w:t>- 复读的一年：住在补习学校宿舍或考试院，和高中同学断了联系，看着他们在大学里谈恋爱。</w:t>
+      </w:r>
+    </w:p>
+    <w:p/>
+    <w:p>
+      <w:r>
+        <w:t>【学阀：分数变成了标签】</w:t>
+      </w:r>
+    </w:p>
+    <w:p>
+      <w:r>
+        <w:t>- SKY（首尔大、高丽大、延世大）、"인서울"（首尔的大学）、地方国立大学（지거국）、地方私立大学，是一张大家心里都有的排名表。</w:t>
+      </w:r>
+    </w:p>
+    <w:p>
+      <w:r>
+        <w:t>- 学历会影响求职、相亲和亲戚的态度。相亲介绍时第一句可能就是学校。</w:t>
+      </w:r>
+    </w:p>
+    <w:p>
+      <w:r>
+        <w:t>- 同一所大学的人会互相照应（학연）。</w:t>
+      </w:r>
+    </w:p>
+    <w:p>
+      <w:r>
+        <w:t>- 写法：名校出身的角色可能被期待更多，也可能对这个标签感到厌倦；非名校出身的角色在某些场合会主动避开学校的话题，或者用能力和自嘲回应。</w:t>
+      </w:r>
+    </w:p>
+    <w:p/>
+    <w:p>
+      <w:r>
+        <w:t>【大学里】</w:t>
+      </w:r>
+    </w:p>
+    <w:p>
+      <w:r>
+        <w:t>- 新生欢迎会、社团、学生会、MT（集体旅行），以及用学号叫人（「몇 학번?」）。</w:t>
+      </w:r>
+    </w:p>
+    <w:p>
+      <w:r>
+        <w:t>- 很多人为了就业休学、去当兵、考证、做实习，五六年才毕业。</w:t>
+      </w:r>
+    </w:p>
+    <w:p>
+      <w:r>
+        <w:t>- 助学贷款是常见的负担。</w:t>
+      </w:r>
+    </w:p>
+    <w:p/>
+    <w:p>
+      <w:r>
+        <w:t>【差异】一路顺利考进名校的人、复读三次的人、主动选择专科或职业路线的人、考进了却发现不是自己想要的人、在考试中崩溃过的人。环境决定"学历在这里有多重"，角色决定他怎么背着它。</w:t>
+      </w:r>
+    </w:p>
+    <w:p>
+      <w:r>
+        <w:t>&lt;/kr_theme_school&gt;</w:t>
+      </w:r>
+    </w:p>
+    <w:p/>
+    <w:p>
+      <w:r>
+        <w:t>═════ 韩国——性别与兵役篇by鲷鱼烧.docx ═════</w:t>
+      </w:r>
+    </w:p>
+    <w:p>
+      <w:r>
+        <w:t>&lt;kr_theme_gender&gt;</w:t>
+      </w:r>
+    </w:p>
+    <w:p>
+      <w:r>
+        <w:t>用途：写性别如何影响韩国年轻人的日常：兵役、性别对立、恋爱和职场里的性别话题。这是当代韩国最容易让气氛变僵的话题之一。写这一篇的目的是让角色身处其中，不是替任何一方表态。</w:t>
+      </w:r>
+    </w:p>
+    <w:p/>
+    <w:p>
+      <w:r>
+        <w:t>【写法总则】</w:t>
+      </w:r>
+    </w:p>
+    <w:p>
+      <w:r>
+        <w:t>- 性别话题在场景里通常是一个"突然变冷的瞬间"：一句玩笑、一个手势、一条新闻、一个投票，让对话停住。写出谁先沉默、谁打圆场、谁当没听见。</w:t>
+      </w:r>
+    </w:p>
+    <w:p>
+      <w:r>
+        <w:t>- 角色对这个话题可以激烈、疲倦、回避或从没想过，但他身边一定有人在乎。</w:t>
+      </w:r>
+    </w:p>
+    <w:p/>
+    <w:p>
+      <w:r>
         <w:t>【兵役：男性的18个月】</w:t>
       </w:r>
     </w:p>
@@ -1339,12 +1787,22 @@
     </w:p>
     <w:p>
       <w:r>
-        <w:t>- 兵役会打断学业和恋爱（「군대 기다려 줄게」），退伍后还有预备军训练。</w:t>
-      </w:r>
-    </w:p>
-    <w:p>
-      <w:r>
-        <w:t>- 军队经历会影响男性的说话方式、对上下级的态度，也会成为话题（「군대 얘기」）。</w:t>
+        <w:t>- 入伍前的剃头、入伍日在训练所门口和家人告别、恋人说「기다려 줄게」、休假（휴가）时回来见朋友。</w:t>
+      </w:r>
+    </w:p>
+    <w:p>
+      <w:r>
+        <w:t>- 退伍后还有几年的预备军训练（예비군），一年被叫去几天，补贴很低。</w:t>
+      </w:r>
+    </w:p>
+    <w:p>
+      <w:r>
+        <w:t>- 军队经历会影响男性的说话方式（「〜했습니다」「다나까」体）、对上下级的态度，也会成为饭桌上的话题（「군대 얘기」），女性常对此感到厌倦。</w:t>
+      </w:r>
+    </w:p>
+    <w:p>
+      <w:r>
+        <w:t>- 兵役影响学业和就业的时间表：同龄男女毕业和就业时间差两年。</w:t>
       </w:r>
     </w:p>
     <w:p>
@@ -1355,69 +1813,90 @@
     <w:p/>
     <w:p>
       <w:r>
-        <w:t>【结婚时间线和比较】</w:t>
-      </w:r>
-    </w:p>
-    <w:p>
-      <w:r>
-        <w:t>- 名节回家时亲戚的问题：「취업은?」「결혼은?」「애는?」「집은?」。</w:t>
-      </w:r>
-    </w:p>
-    <w:p>
-      <w:r>
-        <w:t>- 朋友的婚礼、Instagram上的新房、同学的年薪：比较无处不在。</w:t>
-      </w:r>
-    </w:p>
-    <w:p>
-      <w:r>
-        <w:t>- 「N포세대」：放弃恋爱、结婚、生育、买房……的一代，这是年轻人自嘲时常用的词。</w:t>
-      </w:r>
-    </w:p>
-    <w:p>
-      <w:r>
-        <w:t>- 写法：角色在婚礼上随份子（축의금）时会算该给多少：关系一般5万，熟人10万，参加婚宴要给得更多。</w:t>
+        <w:t>【性别对立】</w:t>
+      </w:r>
+    </w:p>
+    <w:p>
+      <w:r>
+        <w:t>- 二十多岁男女的政治立场差距很大：2025年大选，二十多岁女性多数投给民主党，男性则分散在保守派候选人之间。「이대남」「이대녀」（二十多岁男性／女性）成了政治用语。</w:t>
+      </w:r>
+    </w:p>
+    <w:p>
+      <w:r>
+        <w:t>- 约八成二十多岁的人认为性别矛盾严重。</w:t>
+      </w:r>
+    </w:p>
+    <w:p>
+      <w:r>
+        <w:t>- 网上的对立很激烈：男女各自聚集在不同的网络社区；"女权"一词本身在一些场合会引发冲突；一个被认为是讽刺男性的"捏手指"手势（집게손가락）曾让游戏公司和企业道歉、撤广告，被指认的女员工遭到网暴。</w:t>
+      </w:r>
+    </w:p>
+    <w:p>
+      <w:r>
+        <w:t>- 不恋爱、不结婚、不生育、不发生关系的"4B"主张在网上被讨论，也被反感。</w:t>
+      </w:r>
+    </w:p>
+    <w:p>
+      <w:r>
+        <w:t>- 写法：在聚会、职场、约会中，角色会小心地避开某些词，或者因为一句话对某人改变看法。</w:t>
       </w:r>
     </w:p>
     <w:p/>
     <w:p>
       <w:r>
-        <w:t>【政治和社会气氛】</w:t>
-      </w:r>
-    </w:p>
-    <w:p>
-      <w:r>
-        <w:t>- 2024年12月的戒严、2025年总统被罢免和提前大选，是所有人都记得的事。很多人那段时间熬夜看直播、上街。前总统尹锡悦2026年一审被判无期徒刑。</w:t>
-      </w:r>
-    </w:p>
-    <w:p>
-      <w:r>
-        <w:t>- 2025年6月李在明当选总统；2026年6月地方选举。</w:t>
-      </w:r>
-    </w:p>
-    <w:p>
-      <w:r>
-        <w:t>- 政治在家里、职场和情侣之间都可能是敏感话题。二十多岁男女的政治立场差距很大。</w:t>
-      </w:r>
-    </w:p>
-    <w:p>
-      <w:r>
-        <w:t>- 写法：角色对政治可以热心、冷漠或厌倦，但不会完全不知道。</w:t>
+        <w:t>【真实的风险和不平等】</w:t>
+      </w:r>
+    </w:p>
+    <w:p>
+      <w:r>
+        <w:t>- 性别工资差距在发达国家中最大，约三成。女性结婚生育后中断职业（경력단절）仍很常见。</w:t>
+      </w:r>
+    </w:p>
+    <w:p>
+      <w:r>
+        <w:t>- 男性请育儿假的比例在上升，2025年约三分之一以上的育儿假是男性请的，但在很多公司仍需要看脸色。</w:t>
+      </w:r>
+    </w:p>
+    <w:p>
+      <w:r>
+        <w:t>- 交往暴力和跟踪的报案逐年增加；2024年深度伪造（딥페이크）性影像事件让很多女性删掉了自己的照片，嫌疑人多是十几岁的学生。女性角色晚上回家时的小动作（打电话给朋友、看身后、外卖写假名）是日常。</w:t>
+      </w:r>
+    </w:p>
+    <w:p>
+      <w:r>
+        <w:t>- 2025年女性家族部改组为"性平等家族部"，也有专门处理"男性逆向歧视"的部门，两边都有人不满。</w:t>
       </w:r>
     </w:p>
     <w:p/>
     <w:p>
       <w:r>
-        <w:t>【差异】完全适应竞争的人、表面努力私下很累的人、选择退出竞争的人、在一件事上拒绝（不考公、不结婚、不进大企业）并以此定义自己的人，可以在同一间屋子里。</w:t>
-      </w:r>
-    </w:p>
-    <w:p>
-      <w:r>
-        <w:t>&lt;/kr_theme_pressure&gt;</w:t>
+        <w:t>【恋爱里的性别话题】</w:t>
+      </w:r>
+    </w:p>
+    <w:p>
+      <w:r>
+        <w:t>- 约会费用怎么分、谁该付婚房、结婚后谁的职业让路、要不要孩子，都可能变成性别话题。</w:t>
+      </w:r>
+    </w:p>
+    <w:p>
+      <w:r>
+        <w:t>- 写法：情侣之间因为一条新闻吵起来，吵的其实是彼此对未来的不安。</w:t>
       </w:r>
     </w:p>
     <w:p/>
     <w:p>
       <w:r>
+        <w:t>【差异】在网上积极参与性别争论的人、厌倦了所以绝口不提的人、在朋友圈和恋人之间小心平衡的人、从没想过这些直到某件事发生在自己身上的人。性别是角色的处境，不是他的性格；写他具体的经历和反应，不让角色变成某一方立场的代言人。</w:t>
+      </w:r>
+    </w:p>
+    <w:p>
+      <w:r>
+        <w:t>&lt;/kr_theme_gender&gt;</w:t>
+      </w:r>
+    </w:p>
+    <w:p/>
+    <w:p>
+      <w:r>
         <w:t>═════ 韩国——身体与日常节律篇by鲷鱼烧.docx ═════</w:t>
       </w:r>
     </w:p>
@@ -1680,116 +2159,303 @@
     <w:p/>
     <w:p>
       <w:r>
-        <w:t>【房子：最大的焦虑】</w:t>
-      </w:r>
-    </w:p>
-    <w:p>
-      <w:r>
-        <w:t>- 首尔单间（保证金1000万韩元）的月租约六七十万韩元，江南区超过一百万。</w:t>
-      </w:r>
-    </w:p>
-    <w:p>
-      <w:r>
-        <w:t>- 全租（전세）：交一大笔保证金、不付月租的韩国特有制度。全租诈骗事件后（受害超过四万件），越来越多人改租月租，首尔七成租房是月租。</w:t>
-      </w:r>
-    </w:p>
-    <w:p>
-      <w:r>
-        <w:t>- 首尔公寓均价超过15亿韩元，2026年还在涨。政府在2025年10月把首尔全境纳入管制，贷款变难。「영끌」（掏空所有、贷款到极限买房）是一代人的词。</w:t>
-      </w:r>
-    </w:p>
-    <w:p>
-      <w:r>
-        <w:t>- 写法：角色说起房子时，常常带着放弃或焦虑：「서울에 집은 포기했어」。</w:t>
+        <w:t>【房子】</w:t>
+      </w:r>
+    </w:p>
+    <w:p>
+      <w:r>
+        <w:t>- 房租是最大的固定支出：首尔单间月租约六七十万韩元。房子不只是钱的问题，也是阶层的问题，详见 &lt;kr_theme_house&gt;。</w:t>
+      </w:r>
+    </w:p>
+    <w:p>
+      <w:r>
+        <w:t>【钱花在哪、存在哪】</w:t>
+      </w:r>
+    </w:p>
+    <w:p>
+      <w:r>
+        <w:t>- 追星、旅行（日本很近也便宜）、外貌管理、健身是年轻人愿意花钱的地方。</w:t>
+      </w:r>
+    </w:p>
+    <w:p>
+      <w:r>
+        <w:t>- 理财：2025〜2026年股市大涨，很多年轻人开了股票账户；比特币和其他加密币也是常见话题。上班时偷看股票App、和同事聊三星和SK海力士，是2026年的日常画面。</w:t>
+      </w:r>
+    </w:p>
+    <w:p>
+      <w:r>
+        <w:t>- 青年储蓄：政府有给青年补贴利息的储蓄账户（2026年推出"青年未来储蓄"）。</w:t>
+      </w:r>
+    </w:p>
+    <w:p>
+      <w:r>
+        <w:t>- 国民年金：2025年改革后缴费率逐年上调，年轻人觉得"交了以后也领不到"。</w:t>
       </w:r>
     </w:p>
     <w:p/>
     <w:p>
       <w:r>
-        <w:t>【钱花在哪、存在哪】</w:t>
-      </w:r>
-    </w:p>
-    <w:p>
-      <w:r>
-        <w:t>- 追星、旅行（日本很近也便宜）、外貌管理、健身是年轻人愿意花钱的地方。</w:t>
-      </w:r>
-    </w:p>
-    <w:p>
-      <w:r>
-        <w:t>- 理财：2025〜2026年股市大涨，很多年轻人开了股票账户；比特币和其他加密币也是常见话题。上班时偷看股票App、和同事聊三星和SK海力士，是2026年的日常画面。</w:t>
-      </w:r>
-    </w:p>
-    <w:p>
-      <w:r>
-        <w:t>- 青年储蓄：政府有给青年补贴利息的储蓄账户（2026年推出"青年未来储蓄"）。</w:t>
-      </w:r>
-    </w:p>
-    <w:p>
-      <w:r>
-        <w:t>- 国民年金：2025年改革后缴费率逐年上调，年轻人觉得"交了以后也领不到"。</w:t>
+        <w:t>【钱和人际关系】</w:t>
+      </w:r>
+    </w:p>
+    <w:p>
+      <w:r>
+        <w:t>- 请客文化很强：前辈、年长者、赚得多的人常常请客，「오늘은 내가 쏠게」。被请的人下次买咖啡或下一摊。</w:t>
+      </w:r>
+    </w:p>
+    <w:p>
+      <w:r>
+        <w:t>- 朋友之间用KakaoPay、Toss转账AA（「1/N」）。</w:t>
+      </w:r>
+    </w:p>
+    <w:p>
+      <w:r>
+        <w:t>- 随份子（축의금、조의금）是一笔固定的社交支出。</w:t>
+      </w:r>
+    </w:p>
+    <w:p>
+      <w:r>
+        <w:t>- 钱的话题可以直接问：「연봉 얼마야?」「그거 얼마 줬어?」。被问的人不想回答时会笑着带过。</w:t>
       </w:r>
     </w:p>
     <w:p/>
     <w:p>
       <w:r>
-        <w:t>【钱和人际关系】</w:t>
-      </w:r>
-    </w:p>
-    <w:p>
-      <w:r>
-        <w:t>- 请客文化很强：前辈、年长者、赚得多的人常常请客，「오늘은 내가 쏠게」。被请的人下次买咖啡或下一摊。</w:t>
-      </w:r>
-    </w:p>
-    <w:p>
-      <w:r>
-        <w:t>- 朋友之间用KakaoPay、Toss转账AA（「1/N」）。</w:t>
-      </w:r>
-    </w:p>
-    <w:p>
-      <w:r>
-        <w:t>- 随份子（축의금、조의금）是一笔固定的社交支出。</w:t>
-      </w:r>
-    </w:p>
-    <w:p>
-      <w:r>
-        <w:t>- 钱的话题可以直接问：「연봉 얼마야?」「그거 얼마 줬어?」。被问的人不想回答时会笑着带过。</w:t>
+        <w:t>【一个月里的节奏】</w:t>
+      </w:r>
+    </w:p>
+    <w:p>
+      <w:r>
+        <w:t>- 发薪日（多为25日或10日）：「월급 들어왔다」，然后很快「월급이 스쳐 지나갔다」（工资只是从账户上路过）。</w:t>
+      </w:r>
+    </w:p>
+    <w:p>
+      <w:r>
+        <w:t>- 月末：「텅장」（空空的账户）、刷信用卡分期。</w:t>
+      </w:r>
+    </w:p>
+    <w:p>
+      <w:r>
+        <w:t>- 突发开销：手机坏了、看病、婚礼一个月连着三场。</w:t>
       </w:r>
     </w:p>
     <w:p/>
     <w:p>
       <w:r>
-        <w:t>【一个月里的节奏】</w:t>
-      </w:r>
-    </w:p>
-    <w:p>
-      <w:r>
-        <w:t>- 发薪日（多为25日或10日）：「월급 들어왔다」，然后很快「월급이 스쳐 지나갔다」（工资只是从账户上路过）。</w:t>
-      </w:r>
-    </w:p>
-    <w:p>
-      <w:r>
-        <w:t>- 月末：「텅장」（空空的账户）、刷信用卡分期。</w:t>
-      </w:r>
-    </w:p>
-    <w:p>
-      <w:r>
-        <w:t>- 突发开销：手机坏了、看病、婚礼一个月连着三场。</w:t>
+        <w:t>【差异】从小缺钱的人和不缺钱的人，即使现在赚得一样多，对钱的焦虑点也不同。有人拼命存钱买房，有人认为买房没希望所以现在花掉（「욜로」的余波），多数人在中间摇摆。</w:t>
+      </w:r>
+    </w:p>
+    <w:p>
+      <w:r>
+        <w:t>&lt;/kr_theme_money&gt;</w:t>
       </w:r>
     </w:p>
     <w:p/>
     <w:p>
       <w:r>
-        <w:t>【差异】从小缺钱的人和不缺钱的人，即使现在赚得一样多，对钱的焦虑点也不同。有人拼命存钱买房，有人认为买房没希望所以现在花掉（「욜로」的余波），多数人在中间摇摆。</w:t>
-      </w:r>
-    </w:p>
-    <w:p>
-      <w:r>
-        <w:t>&lt;/kr_theme_money&gt;</w:t>
+        <w:t>═════ 韩国——房子与阶层篇by鲷鱼烧.docx ═════</w:t>
+      </w:r>
+    </w:p>
+    <w:p>
+      <w:r>
+        <w:t>&lt;kr_theme_house&gt;</w:t>
+      </w:r>
+    </w:p>
+    <w:p>
+      <w:r>
+        <w:t>用途：给角色一个具体的住处，并写出房子在韩国代表的阶层。住哪种房子、哪个小区、是租还是买，决定了他的隐私、作息、开销，也决定了别人怎么看他。也包括一个人在房间里的独处。</w:t>
       </w:r>
     </w:p>
     <w:p/>
     <w:p>
       <w:r>
+        <w:t>【写法总则】确定五件事并在场景里体现：房型和面积、和谁住、月租还是全租还是自有、哪个区哪个小区、离地铁站走几分钟。</w:t>
+      </w:r>
+    </w:p>
+    <w:p/>
+    <w:p>
+      <w:r>
+        <w:t>【公寓＝阶层】</w:t>
+      </w:r>
+    </w:p>
+    <w:p>
+      <w:r>
+        <w:t>- 아파트（公寓小区）是韩国人"家"的标准形象，也是财富和阶层的标签。品牌公寓的名字本身就是身份：小区门口的名字、在哪个区。</w:t>
+      </w:r>
+    </w:p>
+    <w:p>
+      <w:r>
+        <w:t>- 地区标签：江南三区（江南、瑞草、松坡）、"마용성"（麻浦・龙山・城东）、"노도강"（芦原・道峰・江北，较便宜）。</w:t>
+      </w:r>
+    </w:p>
+    <w:p>
+      <w:r>
+        <w:t>- 首尔公寓均价超过15亿韩元，房价约是家庭年收入的十倍以上。2025年10月起首尔全境限制投资性买房，贷款更难。</w:t>
+      </w:r>
+    </w:p>
+    <w:p>
+      <w:r>
+        <w:t>- 申购（청약）：存申购储蓄、等抽签，首尔新公寓平均一百多比一，热门的上千比一。很多年轻人放弃申购（「청포족」）。</w:t>
+      </w:r>
+    </w:p>
+    <w:p>
+      <w:r>
+        <w:t>- 歧视：住租赁公寓的孩子在学校被叫「휴거」「엘사」这类蔑称；有的小区在租赁楼和分售楼之间修墙，或者禁止外面的孩子用游乐场。这些事让很多人对"住在哪里"格外敏感。</w:t>
+      </w:r>
+    </w:p>
+    <w:p>
+      <w:r>
+        <w:t>- 写法：角色说出小区名字时的语气，或者被问「어디 살아요?」时的含糊回答，都是阶层信息。</w:t>
+      </w:r>
+    </w:p>
+    <w:p/>
+    <w:p>
+      <w:r>
+        <w:t>【常见的住法（年轻人）】</w:t>
+      </w:r>
+    </w:p>
+    <w:p>
+      <w:r>
+        <w:t>- 원룸（单间）：床、桌子、小厨房在同一个空间，洗衣机在厨房下面，浴室没有浴缸。首尔月租约六七十万韩元，另加管理费。</w:t>
+      </w:r>
+    </w:p>
+    <w:p>
+      <w:r>
+        <w:t>- 오피스텔：商住两用公寓，比单间新、贵，有门禁和快递柜。</w:t>
+      </w:r>
+    </w:p>
+    <w:p>
+      <w:r>
+        <w:t>- 고시원（考试院）：一两坪的小隔间，共用厨房和厕所，便宜。住着考生、打工的人、刚来首尔的人。没有窗户的房间更便宜。</w:t>
+      </w:r>
+    </w:p>
+    <w:p>
+      <w:r>
+        <w:t>- 반지하（半地下）：一半在地下，便宜但潮湿、阴暗，暴雨时有被淹的风险。</w:t>
+      </w:r>
+    </w:p>
+    <w:p>
+      <w:r>
+        <w:t>- 和父母同住：省钱，但晚归要报备、带人回家很难。</w:t>
+      </w:r>
+    </w:p>
+    <w:p>
+      <w:r>
+        <w:t>- 青年住房：政府的青年安心住房、幸福住宅，竞争率常常一百多比一。</w:t>
+      </w:r>
+    </w:p>
+    <w:p/>
+    <w:p>
+      <w:r>
+        <w:t>【全租和月租】</w:t>
+      </w:r>
+    </w:p>
+    <w:p>
+      <w:r>
+        <w:t>- 全租（전세）：交一大笔保证金（首尔单间约两亿韩元），不付月租，退租时拿回。全租诈骗受害超过四万件后，越来越多人改租月租，首尔约七成租房是月租。</w:t>
+      </w:r>
+    </w:p>
+    <w:p>
+      <w:r>
+        <w:t>- 月租（월세）：保证金（常见1000万韩元）＋每月房租。签约时会查房屋登记簿，担心房东欠债。</w:t>
+      </w:r>
+    </w:p>
+    <w:p>
+      <w:r>
+        <w:t>- 合同通常两年，到期就是一个必须做决定的时间点。</w:t>
+      </w:r>
+    </w:p>
+    <w:p/>
+    <w:p>
+      <w:r>
+        <w:t>【房子里的规矩】</w:t>
+      </w:r>
+    </w:p>
+    <w:p>
+      <w:r>
+        <w:t>- 进门脱鞋；地暖（온돌）冬天开得很足，有人睡在地上。</w:t>
+      </w:r>
+    </w:p>
+    <w:p>
+      <w:r>
+        <w:t>- 垃圾：一般垃圾用区里卖的指定垃圾袋，食物垃圾单独扔，可回收分类。</w:t>
+      </w:r>
+    </w:p>
+    <w:p>
+      <w:r>
+        <w:t>- 层间噪音（층간소음）是邻里纠纷的头号原因。</w:t>
+      </w:r>
+    </w:p>
+    <w:p>
+      <w:r>
+        <w:t>- 门锁是密码锁，按密码的声音能听出谁回来了；快递和外卖堆在门口。</w:t>
+      </w:r>
+    </w:p>
+    <w:p/>
+    <w:p>
+      <w:r>
+        <w:t>【一个人在房间里】</w:t>
+      </w:r>
+    </w:p>
+    <w:p>
+      <w:r>
+        <w:t>- 进门后的第一个动作：踢掉鞋、直接倒在床上、先打开外卖App。独处时不用看眼色，声音和姿势都会变。</w:t>
+      </w:r>
+    </w:p>
+    <w:p>
+      <w:r>
+        <w:t>- 혼밥、혼술、혼영、投币KTV一个人唱，都很普通。</w:t>
+      </w:r>
+    </w:p>
+    <w:p>
+      <w:r>
+        <w:t>- 深夜：刷Instagram快拍、反复打开KakaoTalk看对方回没回、打一大段字又删掉、一个人喝一瓶便利店的烧酒。</w:t>
+      </w:r>
+    </w:p>
+    <w:p>
+      <w:r>
+        <w:t>- 孤独：首尔市2025年开通了"孤独热线"（拨120再按5），咨询量远超预期。孤独很少被说出口，角色会说「그냥 집에 있었어」「별일 없어」。</w:t>
+      </w:r>
+    </w:p>
+    <w:p>
+      <w:r>
+        <w:t>- 写法：独处场景里，让角色做一件在别人面前不会做的事，这件事要能透露他的真实状态。</w:t>
+      </w:r>
+    </w:p>
+    <w:p/>
+    <w:p>
+      <w:r>
+        <w:t>【让房子影响剧情】</w:t>
+      </w:r>
+    </w:p>
+    <w:p>
+      <w:r>
+        <w:t>- 带人回家前，先想到房间小、没有沙发、只有一套餐具。</w:t>
+      </w:r>
+    </w:p>
+    <w:p>
+      <w:r>
+        <w:t>- 吵架时压低声音，因为隔壁听得见。</w:t>
+      </w:r>
+    </w:p>
+    <w:p>
+      <w:r>
+        <w:t>- 和父母同住的角色约会到很晚，要编理由或发KakaoTalk报备。</w:t>
+      </w:r>
+    </w:p>
+    <w:p>
+      <w:r>
+        <w:t>- 搬家是转折点：涨薪、恋爱、分手、换工作、全租合同到期。</w:t>
+      </w:r>
+    </w:p>
+    <w:p>
+      <w:r>
+        <w:t>&lt;/kr_theme_house&gt;</w:t>
+      </w:r>
+    </w:p>
+    <w:p/>
+    <w:p>
+      <w:r>
         <w:t>═════ 韩国——流行文化与娱乐篇by鲷鱼烧.docx ═════</w:t>
       </w:r>
     </w:p>
@@ -2136,17 +2802,17 @@
     <w:p/>
     <w:p>
       <w:r>
-        <w:t>═════ 韩国——独处时间篇by鲷鱼烧.docx ═════</w:t>
-      </w:r>
-    </w:p>
-    <w:p>
-      <w:r>
-        <w:t>&lt;kr_theme_alone&gt;</w:t>
-      </w:r>
-    </w:p>
-    <w:p>
-      <w:r>
-        <w:t>用途：角色一个人住、一个人行动，或者需要写"没有别人在场时他是什么样"。</w:t>
+        <w:t>═════ 韩国——宗教与信仰篇by鲷鱼烧.docx ═════</w:t>
+      </w:r>
+    </w:p>
+    <w:p>
+      <w:r>
+        <w:t>&lt;kr_theme_religion&gt;</w:t>
+      </w:r>
+    </w:p>
+    <w:p>
+      <w:r>
+        <w:t>用途：角色信教、家里信教、在教会或寺院有社交圈，或者喜欢算命塔罗时使用。在韩国，宗教是一部分人的社交网络；而算命和四柱几乎是所有年轻人都碰过的东西。</w:t>
       </w:r>
     </w:p>
     <w:p/>
@@ -2157,805 +2823,910 @@
     </w:p>
     <w:p>
       <w:r>
-        <w:t>- 独处时，角色不再需要看眼色。写出这种变化：进门后的第一个动作（踢掉鞋、直接倒在床上、先开外卖App）、声音变了、姿势垮了。</w:t>
-      </w:r>
-    </w:p>
-    <w:p>
-      <w:r>
-        <w:t>- 独处不等于孤独。先确定这一刻是"终于一个人了"还是"又是一个人"，再写。</w:t>
+        <w:t>- 信仰在场景里通过具体的行为出现：周日上午不约人、饭前低头祷告、手机里的教会群、手腕上的念珠、钱包里的护身符、算完命后说的那句「올해 운이 안 좋대」。</w:t>
+      </w:r>
+    </w:p>
+    <w:p>
+      <w:r>
+        <w:t>- 不评判信仰本身。写角色和信仰的关系：虔诚、习惯、被家里要求、离开了、在怀疑。</w:t>
       </w:r>
     </w:p>
     <w:p/>
     <w:p>
       <w:r>
-        <w:t>【一个人做事】</w:t>
-      </w:r>
-    </w:p>
-    <w:p>
-      <w:r>
-        <w:t>- 혼밥（一个人吃饭）、혼술（一个人喝酒）、혼영（一个人看电影）、혼코노（一个人唱投币KTV）已经很普通。很多店有单人座和一人份菜单。</w:t>
-      </w:r>
-    </w:p>
-    <w:p>
-      <w:r>
-        <w:t>- 有人享受，有人只是没人一起。</w:t>
-      </w:r>
-    </w:p>
-    <w:p>
-      <w:r>
-        <w:t>- 写法：让角色在一个人吃饭时做一件只有一个人时才做的小事：边吃边看YouTube、点了平时不好意思点的那道菜。</w:t>
+        <w:t>【谁信什么】</w:t>
+      </w:r>
+    </w:p>
+    <w:p>
+      <w:r>
+        <w:t>- 约四成成年人有宗教信仰：新教（基督教）约两成，佛教约一成多，天主教约一成以下。年轻人信教的少：二十多岁约七成没有宗教，最常见的理由是"没兴趣"。</w:t>
+      </w:r>
+    </w:p>
+    <w:p>
+      <w:r>
+        <w:t>- 所以，信教的年轻角色在同龄人中是少数，常被朋友好奇地问，或者不主动提。</w:t>
       </w:r>
     </w:p>
     <w:p/>
     <w:p>
       <w:r>
-        <w:t>【房间里的独处】</w:t>
-      </w:r>
-    </w:p>
-    <w:p>
-      <w:r>
-        <w:t>- 声音：冰箱、隔壁的电视、楼道里的外卖骑手、楼下的车。单间墙薄，所以自己也会放低声音。</w:t>
-      </w:r>
-    </w:p>
-    <w:p>
-      <w:r>
-        <w:t>- 屏幕：手机是主要伙伴。刷Instagram快拍、看YouTube、反复打开KakaoTalk看对方有没有回。</w:t>
-      </w:r>
-    </w:p>
-    <w:p>
-      <w:r>
-        <w:t>- 吃：在床边的小桌上吃外卖，一次性容器堆在门口等分类扔。</w:t>
+        <w:t>【教会：社交网络】</w:t>
+      </w:r>
+    </w:p>
+    <w:p>
+      <w:r>
+        <w:t>- 很多人从小跟着父母去教会。青年部（청년부）有自己的聚会、修炼会（수련회）、圣诞节活动、乐队和唱诗班。</w:t>
+      </w:r>
+    </w:p>
+    <w:p>
+      <w:r>
+        <w:t>- 教会是认识人的地方："교회 오빠"（教会里的哥哥）是一个常被调侃的形象；在教会认识、在教会结婚的情侣不少。</w:t>
+      </w:r>
+    </w:p>
+    <w:p>
+      <w:r>
+        <w:t>- 父母会希望子女和"信主的人"结婚，这可能成为恋爱的阻力。</w:t>
+      </w:r>
+    </w:p>
+    <w:p>
+      <w:r>
+        <w:t>- 大型教会有几万人，周日的停车场和交通都会堵。</w:t>
+      </w:r>
+    </w:p>
+    <w:p>
+      <w:r>
+        <w:t>- 一部分保守教会参与政治集会，在同性恋议题、选举中很活跃，这让一些年轻信徒感到不舒服，也让不信教的人对教会有偏见。</w:t>
+      </w:r>
+    </w:p>
+    <w:p>
+      <w:r>
+        <w:t>- 写法：信教的角色在饭前会犹豫要不要在朋友面前祷告；离开教会的角色回家过节时，会被父母问「요즘 교회는 나가니?」。</w:t>
       </w:r>
     </w:p>
     <w:p/>
     <w:p>
       <w:r>
-        <w:t>【独处里会冒出来的东西】</w:t>
-      </w:r>
-    </w:p>
-    <w:p>
-      <w:r>
-        <w:t>- 白天压住的事，在一个人的深夜回来：一句没说出口的话、一个没回的消息、"这样过下去可以吗"。</w:t>
-      </w:r>
-    </w:p>
-    <w:p>
-      <w:r>
-        <w:t>- 打了一大段字发给某人，又全部删掉；看前任的快拍又关掉。</w:t>
-      </w:r>
-    </w:p>
-    <w:p>
-      <w:r>
-        <w:t>- 一个人喝一瓶便利店的烧酒或啤酒。</w:t>
-      </w:r>
-    </w:p>
-    <w:p>
-      <w:r>
-        <w:t>- 写法：独处场景里，让角色做一件在别人面前不会做的事，这件事要能透露他的真实状态。</w:t>
+        <w:t>【需要小心的：异端和邪教】</w:t>
+      </w:r>
+    </w:p>
+    <w:p>
+      <w:r>
+        <w:t>- 新天地、JMS等被主流教会称为"异端"的团体，常在大学校园和街头接近年轻人（假装做问卷、心理测试、读书会）。</w:t>
+      </w:r>
+    </w:p>
+    <w:p>
+      <w:r>
+        <w:t>- 2023年Netflix纪录片《나는 신이다》让JMS的性侵问题广为人知；2026年政府调查宗教团体和政党的关系，起诉了一些宗教领袖。</w:t>
+      </w:r>
+    </w:p>
+    <w:p>
+      <w:r>
+        <w:t>- 写法：大学新生被陌生人搭讪「잠깐 설문 좀…」时的警惕；角色怀疑朋友被拉进了某个团体时的担心。</w:t>
       </w:r>
     </w:p>
     <w:p/>
     <w:p>
       <w:r>
-        <w:t>【孤独】</w:t>
-      </w:r>
-    </w:p>
-    <w:p>
-      <w:r>
-        <w:t>- 孤独在韩国被当作社会问题：首尔市2025年开通了"孤独热线"（拨120再按5），咨询量远超预期。</w:t>
-      </w:r>
-    </w:p>
-    <w:p>
-      <w:r>
-        <w:t>- 孤独很少被说出口。角色会说「그냥 집에 있었어」「별일 없어」，或用一个玩笑带过。</w:t>
-      </w:r>
-    </w:p>
-    <w:p>
-      <w:r>
-        <w:t>- 外在信号：周末两天没跟任何人说话；外卖骑手的一句「맛있게 드세요」会让人愣一下；生病时意识到没人可以叫。</w:t>
+        <w:t>【佛教和寺院】</w:t>
+      </w:r>
+    </w:p>
+    <w:p>
+      <w:r>
+        <w:t>- 佛教在老一辈和地方更普遍；年轻人更多是通过寺院寄宿（템플스테이）接触，用来"从现实生活中登出"（현생 로그아웃）。</w:t>
+      </w:r>
+    </w:p>
+    <w:p>
+      <w:r>
+        <w:t>- 寺院里的相亲活动、"佛陀很帅"（부처핸섬）之类的梗让寺院在年轻人中变得亲近。</w:t>
+      </w:r>
+    </w:p>
+    <w:p>
+      <w:r>
+        <w:t>- 佛诞节的灯笼、高考前母亲去寺庙祈祷。</w:t>
       </w:r>
     </w:p>
     <w:p/>
     <w:p>
       <w:r>
-        <w:t>【差异】有人一个人过得很满足，有人害怕安静所以一直开着电视，有人以为自己享受独处，直到某天有人来过之后才发现不是。</w:t>
-      </w:r>
-    </w:p>
-    <w:p>
-      <w:r>
-        <w:t>&lt;/kr_theme_alone&gt;</w:t>
+        <w:t>【天主教】形象较安静、温和，婚礼常在圣堂举行。</w:t>
       </w:r>
     </w:p>
     <w:p/>
     <w:p>
       <w:r>
-        <w:t>═════ 韩国——住处篇by鲷鱼烧.docx ═════</w:t>
-      </w:r>
-    </w:p>
-    <w:p>
-      <w:r>
-        <w:t>&lt;kr_theme_home&gt;</w:t>
-      </w:r>
-    </w:p>
-    <w:p>
-      <w:r>
-        <w:t>用途：给角色一个具体的住处。住在哪种房子里，决定了他的隐私、作息、开销，以及能不能带人回家。</w:t>
+        <w:t>【算命、四柱、塔罗：几乎人人都碰过】</w:t>
+      </w:r>
+    </w:p>
+    <w:p>
+      <w:r>
+        <w:t>- 四柱（사주）、塔罗（타로）、新点（신점，巫俗算命）在年轻人中很流行，付费算命服务的用户大多是二三十岁。</w:t>
+      </w:r>
+    </w:p>
+    <w:p>
+      <w:r>
+        <w:t>- 用App看今日运势、恋爱运；年初去算一年的运；分手后、求职失败后、换工作前去算。</w:t>
+      </w:r>
+    </w:p>
+    <w:p>
+      <w:r>
+        <w:t>- 多数人"半信半疑"：说着「재미로 보는 거지」，但算到不好的会在意好几天。</w:t>
+      </w:r>
+    </w:p>
+    <w:p>
+      <w:r>
+        <w:t>- 写法：角色在做决定前偷偷打开算命App，或者朋友聚会时一起去塔罗咖啡店。</w:t>
       </w:r>
     </w:p>
     <w:p/>
     <w:p>
       <w:r>
-        <w:t>【写法总则】确定四件事并在场景里体现：房型和面积、和谁住、是月租还是全租、离地铁站走几分钟。</w:t>
+        <w:t>【差异】虔诚的信徒、只在节日去的人、被父母要求去的人、离开了教会的人、对宗教反感的人、不信教但每年都去算命的人。宗教是角色的一部分处境，写他具体的习惯和矛盾。</w:t>
+      </w:r>
+    </w:p>
+    <w:p>
+      <w:r>
+        <w:t>&lt;/kr_theme_religion&gt;</w:t>
       </w:r>
     </w:p>
     <w:p/>
     <w:p>
       <w:r>
-        <w:t>【常见的住法】</w:t>
-      </w:r>
-    </w:p>
-    <w:p>
-      <w:r>
-        <w:t>- 원룸（单间）：一个人住的标准起点。床、桌子、小厨房在同一个空间，洗衣机在厨房下面，浴室没有浴缸。首尔月租约六七十万韩元，另加管理费。</w:t>
-      </w:r>
-    </w:p>
-    <w:p>
-      <w:r>
-        <w:t>- 오피스텔：商住两用公寓，比单间新、贵，有门禁和快递柜。</w:t>
-      </w:r>
-    </w:p>
-    <w:p>
-      <w:r>
-        <w:t>- 고시원（考试院）：一两坪大的小隔间，共用厨房和厕所，便宜，原本给考生住，现在住着打工的人、刚来首尔的人。没有窗户的房间更便宜。</w:t>
-      </w:r>
-    </w:p>
-    <w:p>
-      <w:r>
-        <w:t>- 반지하（半地下）：一半在地下，便宜但潮湿、阴暗，暴雨时有被淹的风险。电影《寄生虫》让全世界知道了它。</w:t>
-      </w:r>
-    </w:p>
-    <w:p>
-      <w:r>
-        <w:t>- 和父母同住：省钱，但晚归要报备、带人回家很难。</w:t>
-      </w:r>
-    </w:p>
-    <w:p>
-      <w:r>
-        <w:t>- 宿舍、合租（셰어하우스）、公司宿舍。</w:t>
-      </w:r>
-    </w:p>
-    <w:p>
-      <w:r>
-        <w:t>- 公寓（아파트）：韩国人的"家"的标准形象，也是很多年轻人买不起的东西。</w:t>
-      </w:r>
-    </w:p>
-    <w:p>
-      <w:r>
-        <w:t>- 青年住房：政府的青年安心住房、幸福住宅，房租便宜，但竞争率常常一百多比一。</w:t>
+        <w:t>═════ 韩国——非标准路径篇by鲷鱼烧.docx ═════</w:t>
+      </w:r>
+    </w:p>
+    <w:p>
+      <w:r>
+        <w:t>&lt;kr_theme_path&gt;</w:t>
+      </w:r>
+    </w:p>
+    <w:p>
+      <w:r>
+        <w:t>用途：角色不走"名校→大企业→结婚买房"这条标准线时使用：打工、合同工、自由职业、备考族、"休息中"的年轻人、复读、专科、辞职后的空白期。</w:t>
       </w:r>
     </w:p>
     <w:p/>
     <w:p>
       <w:r>
-        <w:t>【全租和月租】</w:t>
-      </w:r>
-    </w:p>
-    <w:p>
-      <w:r>
-        <w:t>- 全租（전세）：交一大笔保证金（首尔单间约两亿韩元），不付月租，退租时拿回保证金。全租诈骗让很多年轻人失去了保证金，现在更多人选择月租。</w:t>
-      </w:r>
-    </w:p>
-    <w:p>
-      <w:r>
-        <w:t>- 月租（월세）：保证金（常见1000万韩元）＋每月房租。</w:t>
-      </w:r>
-    </w:p>
-    <w:p>
-      <w:r>
-        <w:t>- 签约时会查房屋登记簿、担心房东欠债。</w:t>
+        <w:t>【写法总则】</w:t>
+      </w:r>
+    </w:p>
+    <w:p>
+      <w:r>
+        <w:t>- 先确定身份标签，它决定了收入、时间表和别人看他的眼光：正规职／合同工（계약직）／派遣／打工（알바）／自由职业（프리랜서）／备考生（수험생、공시생）／"休息中"（쉬었음）。</w:t>
+      </w:r>
+    </w:p>
+    <w:p>
+      <w:r>
+        <w:t>- 被问「요즘 뭐 해?」是这类角色的常见小压力。写出他准备好的说法，以及说的时候的停顿。</w:t>
       </w:r>
     </w:p>
     <w:p/>
     <w:p>
       <w:r>
-        <w:t>【房子里的规矩】</w:t>
-      </w:r>
-    </w:p>
-    <w:p>
-      <w:r>
-        <w:t>- 进门脱鞋；地暖（온돌）冬天开得很足，有人睡在地上。</w:t>
-      </w:r>
-    </w:p>
-    <w:p>
-      <w:r>
-        <w:t>- 垃圾：一般垃圾用区里卖的指定垃圾袋，食物垃圾单独扔，可回收分类。</w:t>
-      </w:r>
-    </w:p>
-    <w:p>
-      <w:r>
-        <w:t>- 层间噪音（층간소음）是邻里纠纷的头号原因：楼上的脚步声、半夜的洗衣机。</w:t>
-      </w:r>
-    </w:p>
-    <w:p>
-      <w:r>
-        <w:t>- 快递和外卖堆在门口，门锁是密码锁，按密码的声音能听出谁回来了。</w:t>
+        <w:t>【2026年的现实】</w:t>
+      </w:r>
+    </w:p>
+    <w:p>
+      <w:r>
+        <w:t>- "休息中"的年轻人：不工作也不找工作的青年有几十万，2025年创历史新高，2026年开始略减。原因是找不到满意的工作、累了、在准备别的。</w:t>
+      </w:r>
+    </w:p>
+    <w:p>
+      <w:r>
+        <w:t>- 打工时薪以最低工资为基准：2026年10,320韩元。便利店、咖啡店、餐厅、物流中心是常见的打工地点。</w:t>
+      </w:r>
+    </w:p>
+    <w:p>
+      <w:r>
+        <w:t>- 同时做几份工作的人（N잡러）创新高：白天上班，晚上做外卖配送、代驾、网店、接设计。</w:t>
+      </w:r>
+    </w:p>
+    <w:p>
+      <w:r>
+        <w:t>- 外卖骑手和代驾：按单计酬，看天气和时段吃饭。</w:t>
+      </w:r>
+    </w:p>
+    <w:p>
+      <w:r>
+        <w:t>- 备考：公务员、教师、资格证考试。考试村、自习室（스터디카페）、网课，一考就是一两年。</w:t>
       </w:r>
     </w:p>
     <w:p/>
     <w:p>
       <w:r>
-        <w:t>【写法】让房子影响剧情：</w:t>
-      </w:r>
-    </w:p>
-    <w:p>
-      <w:r>
-        <w:t>- 带人回家前，先想到房间小、没有沙发、只有一套餐具。</w:t>
-      </w:r>
-    </w:p>
-    <w:p>
-      <w:r>
-        <w:t>- 吵架时压低声音，因为隔壁听得见。</w:t>
-      </w:r>
-    </w:p>
-    <w:p>
-      <w:r>
-        <w:t>- 和父母同住的角色约会到很晚，要编理由或发KakaoTalk报备。</w:t>
-      </w:r>
-    </w:p>
-    <w:p>
-      <w:r>
-        <w:t>- 搬家是转折点：涨薪、恋爱、分手、换工作，常伴随一次搬家。合同到期（两年）也是一个必须做决定的时间点。</w:t>
-      </w:r>
-    </w:p>
-    <w:p>
-      <w:r>
-        <w:t>&lt;/kr_theme_home&gt;</w:t>
+        <w:t>【学历路线】</w:t>
+      </w:r>
+    </w:p>
+    <w:p>
+      <w:r>
+        <w:t>- 大学升学率很高，所以"没上大学"会被追问；专科大学（전문대）和职业学校学一门手艺直接就业。</w:t>
+      </w:r>
+    </w:p>
+    <w:p>
+      <w:r>
+        <w:t>- 复读（재수、삼수）常见；为了考医学院反复复读的人也不少（2027年医学院扩招）。</w:t>
+      </w:r>
+    </w:p>
+    <w:p>
+      <w:r>
+        <w:t>- 很多人背着助学贷款，毕业后边工作边还。</w:t>
       </w:r>
     </w:p>
     <w:p/>
     <w:p>
       <w:r>
-        <w:t>═════ 韩国——非标准路径篇by鲷鱼烧.docx ═════</w:t>
-      </w:r>
-    </w:p>
-    <w:p>
-      <w:r>
-        <w:t>&lt;kr_theme_path&gt;</w:t>
-      </w:r>
-    </w:p>
-    <w:p>
-      <w:r>
-        <w:t>用途：角色不走"名校→大企业→结婚买房"这条标准线时使用：打工、合同工、自由职业、备考族、"休息中"的年轻人、复读、专科、辞职后的空白期。</w:t>
+        <w:t>【别人怎么看】</w:t>
+      </w:r>
+    </w:p>
+    <w:p>
+      <w:r>
+        <w:t>- 父母和亲戚：「취업은 언제 하니?」「공무원 시험이라도 봐」。</w:t>
+      </w:r>
+    </w:p>
+    <w:p>
+      <w:r>
+        <w:t>- 同学聚会：别人报出公司名时，他说的是"在准备点东西"。</w:t>
+      </w:r>
+    </w:p>
+    <w:p>
+      <w:r>
+        <w:t>- 恋爱和结婚：收入不稳定会被对方父母问到。</w:t>
+      </w:r>
+    </w:p>
+    <w:p>
+      <w:r>
+        <w:t>- 但在一些圈子里（音乐、演员、创作、自由职业者社群），这种生活是常态。</w:t>
       </w:r>
     </w:p>
     <w:p/>
     <w:p>
       <w:r>
+        <w:t>【写法】</w:t>
+      </w:r>
+    </w:p>
+    <w:p>
+      <w:r>
+        <w:t>- 时间表和别人不一样：平日白天有空、周末上班、深夜回家。</w:t>
+      </w:r>
+    </w:p>
+    <w:p>
+      <w:r>
+        <w:t>- 钱按周或按天算。</w:t>
+      </w:r>
+    </w:p>
+    <w:p>
+      <w:r>
+        <w:t>- 有一个"打工之外真正想做的事"，或者没有。两者都要写得具体。</w:t>
+      </w:r>
+    </w:p>
+    <w:p>
+      <w:r>
+        <w:t>&lt;/kr_theme_path&gt;</w:t>
+      </w:r>
+    </w:p>
+    <w:p/>
+    <w:p>
+      <w:r>
+        <w:t>═════ 韩国——少数身份篇by鲷鱼烧.docx ═════</w:t>
+      </w:r>
+    </w:p>
+    <w:p>
+      <w:r>
+        <w:t>&lt;kr_theme_minority&gt;</w:t>
+      </w:r>
+    </w:p>
+    <w:p>
+      <w:r>
+        <w:t>用途：角色是LGBTQ+、外国人或外国出身、多文化家庭子女、脱北者、残障者时使用。这些身份是他在社会里的处境，不是他的全部性格。</w:t>
+      </w:r>
+    </w:p>
+    <w:p/>
+    <w:p>
+      <w:r>
         <w:t>【写法总则】</w:t>
       </w:r>
     </w:p>
     <w:p>
       <w:r>
-        <w:t>- 先确定身份标签，它决定了收入、时间表和别人看他的眼光：正规职／合同工（계약직）／派遣／打工（알바）／自由职业（프리랜서）／备考生（수험생、공시생）／"休息中"（쉬었음）。</w:t>
-      </w:r>
-    </w:p>
-    <w:p>
-      <w:r>
-        <w:t>- 被问「요즘 뭐 해?」是这类角色的常见小压力。写出他准备好的说法，以及说的时候的停顿。</w:t>
+        <w:t>- 写具体的日常时刻：表格上的一栏、租房时的一个电话、被问「어느 나라 사람이에요?」、体检时要不要说。不写大段的社会议题讨论。</w:t>
+      </w:r>
+    </w:p>
+    <w:p>
+      <w:r>
+        <w:t>- 让角色自己决定对谁说、说多少。很多人选择不公开，这是保护日常的策略。</w:t>
+      </w:r>
+    </w:p>
+    <w:p>
+      <w:r>
+        <w:t>- 角色有自己的兴趣、工作、恋爱和缺点，身份只是其中一层。</w:t>
       </w:r>
     </w:p>
     <w:p/>
     <w:p>
       <w:r>
-        <w:t>【2026年的现实】</w:t>
-      </w:r>
-    </w:p>
-    <w:p>
-      <w:r>
-        <w:t>- "休息中"的年轻人：不工作也不找工作的青年有几十万，2025年创历史新高，2026年开始略减。原因是找不到满意的工作、累了、在准备别的。</w:t>
-      </w:r>
-    </w:p>
-    <w:p>
-      <w:r>
-        <w:t>- 打工时薪以最低工资为基准：2026年10,320韩元。便利店、咖啡店、餐厅、物流中心是常见的打工地点。</w:t>
-      </w:r>
-    </w:p>
-    <w:p>
-      <w:r>
-        <w:t>- 同时做几份工作的人（N잡러）创新高：白天上班，晚上做外卖配送、代驾、网店、接设计。</w:t>
-      </w:r>
-    </w:p>
-    <w:p>
-      <w:r>
-        <w:t>- 外卖骑手和代驾：按单计酬，看天气和时段吃饭。</w:t>
-      </w:r>
-    </w:p>
-    <w:p>
-      <w:r>
-        <w:t>- 备考：公务员、教师、资格证考试。考试村、自习室（스터디카페）、网课，一考就是一两年。</w:t>
+        <w:t>【LGBTQ+】</w:t>
+      </w:r>
+    </w:p>
+    <w:p>
+      <w:r>
+        <w:t>- 同性婚姻在韩国不合法，综合反歧视法多年来一直没有通过。2024年最高法院承认同性伴侣可以作为健康保险的被扶养人，这是一个小进展。</w:t>
+      </w:r>
+    </w:p>
+    <w:p>
+      <w:r>
+        <w:t>- 首尔酷儿文化节多年借不到首尔广场，2026年在附近的街道举办。反对团体的集会常在旁边。</w:t>
+      </w:r>
+    </w:p>
+    <w:p>
+      <w:r>
+        <w:t>- 日常：多数人在职场和家里不出柜；男性在军队里的经历可能更艰难；梨泰院、钟路的一些酒吧是熟悉的去处；很多人在网上或小圈子里才能放松。</w:t>
+      </w:r>
+    </w:p>
+    <w:p>
+      <w:r>
+        <w:t>- 写法：对朋友说、对家人说、对公司说，通常是三个不同的决定。</w:t>
       </w:r>
     </w:p>
     <w:p/>
     <w:p>
       <w:r>
-        <w:t>【学历路线】</w:t>
-      </w:r>
-    </w:p>
-    <w:p>
-      <w:r>
-        <w:t>- 大学升学率很高，所以"没上大学"会被追问；专科大学（전문대）和职业学校学一门手艺直接就业。</w:t>
-      </w:r>
-    </w:p>
-    <w:p>
-      <w:r>
-        <w:t>- 复读（재수、삼수）常见；为了考医学院反复复读的人也不少（2027年医学院扩招）。</w:t>
-      </w:r>
-    </w:p>
-    <w:p>
-      <w:r>
-        <w:t>- 很多人背着助学贷款，毕业后边工作边还。</w:t>
+        <w:t>【外国人与多文化家庭】</w:t>
+      </w:r>
+    </w:p>
+    <w:p>
+      <w:r>
+        <w:t>- 2025年底在韩外国人约278万，占人口5%多，创历史新高。最多的是中国籍（含朝鲜族），其次是越南、美国。</w:t>
+      </w:r>
+    </w:p>
+    <w:p>
+      <w:r>
+        <w:t>- 工厂、农场、渔船、餐厅、护理现场有很多外国劳动者（雇佣许可制），2026年配额减少。</w:t>
+      </w:r>
+    </w:p>
+    <w:p>
+      <w:r>
+        <w:t>- 结婚移民（尤其是越南、中国、菲律宾的女性）和她们的子女组成了"多文化家庭"。在农村地区比例更高。</w:t>
+      </w:r>
+    </w:p>
+    <w:p>
+      <w:r>
+        <w:t>- 多文化家庭的孩子可能在学校被叫「다문화」，被问「엄마 어느 나라 사람이야?」。</w:t>
+      </w:r>
+    </w:p>
+    <w:p>
+      <w:r>
+        <w:t>- 写法：外国人角色的韩语水平要具体（敬语用得好不好、方言听不听得懂）。别人常夸「한국말 잘하시네요」，他听到第一百次时的反应可以写。</w:t>
       </w:r>
     </w:p>
     <w:p/>
     <w:p>
       <w:r>
-        <w:t>【别人怎么看】</w:t>
-      </w:r>
-    </w:p>
-    <w:p>
-      <w:r>
-        <w:t>- 父母和亲戚：「취업은 언제 하니?」「공무원 시험이라도 봐」。</w:t>
-      </w:r>
-    </w:p>
-    <w:p>
-      <w:r>
-        <w:t>- 同学聚会：别人报出公司名时，他说的是"在准备点东西"。</w:t>
-      </w:r>
-    </w:p>
-    <w:p>
-      <w:r>
-        <w:t>- 恋爱和结婚：收入不稳定会被对方父母问到。</w:t>
-      </w:r>
-    </w:p>
-    <w:p>
-      <w:r>
-        <w:t>- 但在一些圈子里（音乐、演员、创作、自由职业者社群），这种生活是常态。</w:t>
+        <w:t>【脱北者】</w:t>
+      </w:r>
+    </w:p>
+    <w:p>
+      <w:r>
+        <w:t>- 累计约三万四千人，近年每年入境两三百人，多为二三十岁。</w:t>
+      </w:r>
+    </w:p>
+    <w:p>
+      <w:r>
+        <w:t>- 常见经历：口音被注意、对资本主义的生活规则（信用卡、合同、求职）需要适应、对北边家人的牵挂、被好奇地追问。</w:t>
+      </w:r>
+    </w:p>
+    <w:p>
+      <w:r>
+        <w:t>- 很多人选择不说自己的出身，说是"从延边来的"或"从江原道来的"。</w:t>
       </w:r>
     </w:p>
     <w:p/>
     <w:p>
       <w:r>
-        <w:t>【写法】</w:t>
-      </w:r>
-    </w:p>
-    <w:p>
-      <w:r>
-        <w:t>- 时间表和别人不一样：平日白天有空、周末上班、深夜回家。</w:t>
-      </w:r>
-    </w:p>
-    <w:p>
-      <w:r>
-        <w:t>- 钱按周或按天算。</w:t>
-      </w:r>
-    </w:p>
-    <w:p>
-      <w:r>
-        <w:t>- 有一个"打工之外真正想做的事"，或者没有。两者都要写得具体。</w:t>
-      </w:r>
-    </w:p>
-    <w:p>
-      <w:r>
-        <w:t>&lt;/kr_theme_path&gt;</w:t>
+        <w:t>【残障】</w:t>
+      </w:r>
+    </w:p>
+    <w:p>
+      <w:r>
+        <w:t>- 残障人士的出行权是持续的社会议题：残障团体在首尔早高峰的地铁里示威，2026年7月又恢复了。车厢里的人有人支持，有人烦躁抱怨，这本身就是一个场景。</w:t>
+      </w:r>
+    </w:p>
+    <w:p>
+      <w:r>
+        <w:t>- 写法：写具体的困难和应对（没有电梯的地铁出口、轮椅进不去的小餐馆），而不是用诊断名代替性格。</w:t>
       </w:r>
     </w:p>
     <w:p/>
     <w:p>
       <w:r>
-        <w:t>═════ 韩国——少数身份篇by鲷鱼烧.docx ═════</w:t>
-      </w:r>
-    </w:p>
-    <w:p>
-      <w:r>
-        <w:t>&lt;kr_theme_minority&gt;</w:t>
-      </w:r>
-    </w:p>
-    <w:p>
-      <w:r>
-        <w:t>用途：角色是LGBTQ+、外国人或外国出身、多文化家庭子女、脱北者、残障者时使用。这些身份是他在社会里的处境，不是他的全部性格。</w:t>
+        <w:t>【混血和外貌】</w:t>
+      </w:r>
+    </w:p>
+    <w:p>
+      <w:r>
+        <w:t>- 外貌不同的人常被盯着看、被默认会说英语、被问「혼혈이에요?」。在韩国长大、只会韩语的人尤其别扭。</w:t>
+      </w:r>
+    </w:p>
+    <w:p>
+      <w:r>
+        <w:t>- 写法：写他对这些问题已经形成的固定回答，以及在什么时候会懒得回答。</w:t>
+      </w:r>
+    </w:p>
+    <w:p>
+      <w:r>
+        <w:t>&lt;/kr_theme_minority&gt;</w:t>
       </w:r>
     </w:p>
     <w:p/>
     <w:p>
       <w:r>
-        <w:t>【写法总则】</w:t>
-      </w:r>
-    </w:p>
-    <w:p>
-      <w:r>
-        <w:t>- 写具体的日常时刻：表格上的一栏、租房时的一个电话、被问「어느 나라 사람이에요?」、体检时要不要说。不写大段的社会议题讨论。</w:t>
-      </w:r>
-    </w:p>
-    <w:p>
-      <w:r>
-        <w:t>- 让角色自己决定对谁说、说多少。很多人选择不公开，这是保护日常的策略。</w:t>
-      </w:r>
-    </w:p>
-    <w:p>
-      <w:r>
-        <w:t>- 角色有自己的兴趣、工作、恋爱和缺点，身份只是其中一层。</w:t>
+        <w:t>═════ 首尔本地地名、说话方式、饮食文化by鲷鱼烧.docx ═════</w:t>
+      </w:r>
+    </w:p>
+    <w:p>
+      <w:r>
+        <w:t>&lt;kr_local_seoul&gt;</w:t>
+      </w:r>
+    </w:p>
+    <w:p>
+      <w:r>
+        <w:t>用途：给住在首尔的角色提供本地人才会用的叫法、路线和吃喝习惯。角色在对话里自然带出一两个即可，一次回复最多用一个街区外号或一句首尔口头禅，不要列举。</w:t>
       </w:r>
     </w:p>
     <w:p/>
     <w:p>
       <w:r>
-        <w:t>【LGBTQ+】</w:t>
-      </w:r>
-    </w:p>
-    <w:p>
-      <w:r>
-        <w:t>- 同性婚姻在韩国不合法，综合反歧视法多年来一直没有通过。2024年最高法院承认同性伴侣可以作为健康保险的被扶养人，这是一个小进展。</w:t>
-      </w:r>
-    </w:p>
-    <w:p>
-      <w:r>
-        <w:t>- 首尔酷儿文化节多年借不到首尔广场，2026年在附近的街道举办。反对团体的集会常在旁边。</w:t>
-      </w:r>
-    </w:p>
-    <w:p>
-      <w:r>
-        <w:t>- 日常：多数人在职场和家里不出柜；男性在军队里的经历可能更艰难；梨泰院、钟路的一些酒吧是熟悉的去处；很多人在网上或小圈子里才能放松。</w:t>
-      </w:r>
-    </w:p>
-    <w:p>
-      <w:r>
-        <w:t>- 写法：对朋友说、对家人说、对公司说，通常是三个不同的决定。</w:t>
+        <w:t>【街区外号：本地人随口这么叫】</w:t>
+      </w:r>
+    </w:p>
+    <w:p>
+      <w:r>
+        <w:t>- 연트럴파크＝延南洞的京义线林荫道（废铁路改成的公园），名字模仿纽约中央公园。草坪野餐、二十多岁的人多。</w:t>
+      </w:r>
+    </w:p>
+    <w:p>
+      <w:r>
+        <w:t>- 망리단길＝望远洞。生活感的小街，望远市场和小咖啡店，走路就能到望远汉江公园。</w:t>
+      </w:r>
+    </w:p>
+    <w:p>
+      <w:r>
+        <w:t>- "〜리단길"已经成了"网红小街"的通用后缀：송리단길（石村湖附近，约会商圈）、해리단길（釜山海云台）等。</w:t>
+      </w:r>
+    </w:p>
+    <w:p>
+      <w:r>
+        <w:t>- 힙지로＝乙支路三四街。印刷厂和五金店楼上没有招牌的酒吧，加上老街的生啤胡同（노가리골목）。部分老店因再开发被拆。</w:t>
+      </w:r>
+    </w:p>
+    <w:p>
+      <w:r>
+        <w:t>- 성수＝圣水洞。"首尔的布鲁克林"、"快闪店圣地"：品牌快闪店每周轮换，工厂改造的咖啡店，周末排队。房租暴涨，"绅士化"（젠트리피케이션）是常见话题。</w:t>
+      </w:r>
+    </w:p>
+    <w:p>
+      <w:r>
+        <w:t>- 익선동：韩屋小巷，复古风，约会和穿韩服拍照，很商业化。</w:t>
+      </w:r>
+    </w:p>
+    <w:p>
+      <w:r>
+        <w:t>- 서촌：景福宫西边，书店、画廊、通仁市场，安静文艺。（北村游客太多，已有限制通行时间。）</w:t>
+      </w:r>
+    </w:p>
+    <w:p>
+      <w:r>
+        <w:t>- 문래동：铁工厂和艺术家工作室混在一起。</w:t>
+      </w:r>
+    </w:p>
+    <w:p>
+      <w:r>
+        <w:t>- 한남동：有钱人住、时尚旗舰店、高价餐厅。</w:t>
+      </w:r>
+    </w:p>
+    <w:p>
+      <w:r>
+        <w:t>- 힙당동＝新堂洞。原本是辣炒年糕一条街，近年中央市场里的复古小酒馆火了。</w:t>
+      </w:r>
+    </w:p>
+    <w:p>
+      <w:r>
+        <w:t>- 가로수길：曾经最潮，2025年空置率四成多，被叫作"幽灵胡同"。角色提起它会带一点"那地方已经不行了"的语气。</w:t>
+      </w:r>
+    </w:p>
+    <w:p>
+      <w:r>
+        <w:t>- 압구정로데오：衰落过又重新热起来，年轻品牌回来了。</w:t>
+      </w:r>
+    </w:p>
+    <w:p>
+      <w:r>
+        <w:t>- 이태원：外国风格的街区。2022年万圣节踩踏事故（10.29）后，那条小巷成了纪念的路。很多人提到「그날」会沉默，万圣节会避开人多的地方。角色提起时要慎重。</w:t>
       </w:r>
     </w:p>
     <w:p/>
     <w:p>
       <w:r>
-        <w:t>【外国人与多文化家庭】</w:t>
-      </w:r>
-    </w:p>
-    <w:p>
-      <w:r>
-        <w:t>- 2025年底在韩外国人约278万，占人口5%多，创历史新高。最多的是中国籍（含朝鲜族），其次是越南、美国。</w:t>
-      </w:r>
-    </w:p>
-    <w:p>
-      <w:r>
-        <w:t>- 工厂、农场、渔船、餐厅、护理现场有很多外国劳动者（雇佣许可制），2026年配额减少。</w:t>
-      </w:r>
-    </w:p>
-    <w:p>
-      <w:r>
-        <w:t>- 结婚移民（尤其是越南、中国、菲律宾的女性）和她们的子女组成了"多文化家庭"。在农村地区比例更高。</w:t>
-      </w:r>
-    </w:p>
-    <w:p>
-      <w:r>
-        <w:t>- 多文化家庭的孩子可能在学校被叫「다문화」，被问「엄마 어느 나라 사람이야?」。</w:t>
-      </w:r>
-    </w:p>
-    <w:p>
-      <w:r>
-        <w:t>- 写法：外国人角色的韩语水平要具体（敬语用得好不好、方言听不听得懂）。别人常夸「한국말 잘하시네요」，他听到第一百次时的反应可以写。</w:t>
+        <w:t>【用地铁和出口定位】</w:t>
+      </w:r>
+    </w:p>
+    <w:p>
+      <w:r>
+        <w:t>- 问怎么来：「몇 호선 타?」。2号线是绿色环线；9号线急行在早高峰被叫作"地狱铁"（지옥철）；新盆唐线票价单独计算，连着江南和板桥（IT公司多）。</w:t>
+      </w:r>
+    </w:p>
+    <w:p>
+      <w:r>
+        <w:t>- 约见面说站名＋出口号：「강남역 11번 출구에서 봐」。出口号说错能差一个街区。</w:t>
+      </w:r>
+    </w:p>
+    <w:p>
+      <w:r>
+        <w:t>- 京畿道民的口头禅：「막차 끊기기 전에 가야 돼」（得在末班车停之前走）、「경기도민 왕복 3시간」。坐红色广域巴士（빨간버스），满员了站着不让上。GTX-A开通后，从坡州运井到首尔站约20分钟。</w:t>
+      </w:r>
+    </w:p>
+    <w:p>
+      <w:r>
+        <w:t>- 江南和江北是阶层标签："江南8学群"、"大峙洞补习班一条街"。"마용성"（麻浦・龙山・城东）是新晋的高房价区。</w:t>
       </w:r>
     </w:p>
     <w:p/>
     <w:p>
       <w:r>
-        <w:t>【脱北者】</w:t>
-      </w:r>
-    </w:p>
-    <w:p>
-      <w:r>
-        <w:t>- 累计约三万四千人，近年每年入境两三百人，多为二三十岁。</w:t>
-      </w:r>
-    </w:p>
-    <w:p>
-      <w:r>
-        <w:t>- 常见经历：口音被注意、对资本主义的生活规则（信用卡、合同、求职）需要适应、对北边家人的牵挂、被好奇地追问。</w:t>
-      </w:r>
-    </w:p>
-    <w:p>
-      <w:r>
-        <w:t>- 很多人选择不说自己的出身，说是"从延边来的"或"从江原道来的"。</w:t>
+        <w:t>【吃喝】</w:t>
+      </w:r>
+    </w:p>
+    <w:p>
+      <w:r>
+        <w:t>- 广藏市场：绿豆煎饼、"麻药紫菜包饭"、生拌牛肉。游客多，2023年因宰客被骂过。</w:t>
+      </w:r>
+    </w:p>
+    <w:p>
+      <w:r>
+        <w:t>- 乙支路노가리골목：塑料椅子摆上街，生啤配明太鱼干，下班族聚集。</w:t>
+      </w:r>
+    </w:p>
+    <w:p>
+      <w:r>
+        <w:t>- 한강라면：在汉江公园的便利店用自动煮面机煮泡面，配外卖送来的炸鸡啤酒（치맥）。</w:t>
+      </w:r>
+    </w:p>
+    <w:p>
+      <w:r>
+        <w:t>- 포차：路边帐篷酒摊（越来越少）和室内酒摊（실내포차）。</w:t>
+      </w:r>
+    </w:p>
+    <w:p>
+      <w:r>
+        <w:t>- 喝酒的习惯：「1차, 2차, 3차」一场接一场；소맥＝烧酒兑啤酒，有人讲究比例；聚餐开始有人说祝酒词（건배사）；给年长者倒酒要双手，自己喝的时候侧过脸。</w:t>
       </w:r>
     </w:p>
     <w:p/>
     <w:p>
       <w:r>
-        <w:t>【残障】</w:t>
-      </w:r>
-    </w:p>
-    <w:p>
-      <w:r>
-        <w:t>- 残障人士的出行权是持续的社会议题：残障团体在首尔早高峰的地铁里示威，2026年7月又恢复了。车厢里的人有人支持，有人烦躁抱怨，这本身就是一个场景。</w:t>
-      </w:r>
-    </w:p>
-    <w:p>
-      <w:r>
-        <w:t>- 写法：写具体的困难和应对（没有电梯的地铁出口、轮椅进不去的小餐馆），而不是用诊断名代替性格。</w:t>
+        <w:t>【首尔口语：放进台词，不加解释】</w:t>
+      </w:r>
+    </w:p>
+    <w:p>
+      <w:r>
+        <w:t>- 「〜거든」：解释原因或先摆出前提。「나 오늘 야근이거든」。</w:t>
+      </w:r>
+    </w:p>
+    <w:p>
+      <w:r>
+        <w:t>- 「〜잖아」：你明明知道的。「내가 말했잖아」。</w:t>
+      </w:r>
+    </w:p>
+    <w:p>
+      <w:r>
+        <w:t>- 句尾上扬：疑问只靠语调，不用"〜나/〜노"。年轻人撒娇时会说「했어용」「몰라용」。</w:t>
+      </w:r>
+    </w:p>
+    <w:p>
+      <w:r>
+        <w:t>- 年轻人的缩略语：「ㄹㅇ」（真的）、「ㅇㅈ」（认同）、「킹받네」（气死）、「갓생」（努力自律地生活）、「찐」（真正的）、「〜각」（看样子要……）。「헐」「대박」还在用，但年轻人听来有点老派。</w:t>
+      </w:r>
+    </w:p>
+    <w:p>
+      <w:r>
+        <w:t>- 用新词时符合角色年龄：三十多岁的人说十几岁的流行语会显得刻意。</w:t>
       </w:r>
     </w:p>
     <w:p/>
     <w:p>
       <w:r>
-        <w:t>【混血和外貌】</w:t>
-      </w:r>
-    </w:p>
-    <w:p>
-      <w:r>
-        <w:t>- 外貌不同的人常被盯着看、被默认会说英语、被问「혼혈이에요?」。在韩国长大、只会韩语的人尤其别扭。</w:t>
-      </w:r>
-    </w:p>
-    <w:p>
-      <w:r>
-        <w:t>- 写法：写他对这些问题已经形成的固定回答，以及在什么时候会懒得回答。</w:t>
-      </w:r>
-    </w:p>
-    <w:p>
-      <w:r>
-        <w:t>&lt;/kr_theme_minority&gt;</w:t>
+        <w:t>【例句（只示范方向，换成角色自己的话）】</w:t>
+      </w:r>
+    </w:p>
+    <w:p>
+      <w:r>
+        <w:t>「연남동 갈래? 날씨 좋은데」「성수 팝업 줄 너무 길어」「나 9호선이라 일찍 나가야 돼」「강남역 11번 출구 앞이야」「한강 가서 라면 먹을래?」</w:t>
       </w:r>
     </w:p>
     <w:p/>
     <w:p>
       <w:r>
-        <w:t>═════ 首尔本地地名、说话方式、饮食文化by鲷鱼烧.docx ═════</w:t>
-      </w:r>
-    </w:p>
-    <w:p>
-      <w:r>
-        <w:t>&lt;kr_local_seoul&gt;</w:t>
-      </w:r>
-    </w:p>
-    <w:p>
-      <w:r>
-        <w:t>用途：给住在首尔的角色提供本地人才会用的叫法、路线和吃喝习惯。角色在对话里自然带出一两个即可，一次回复最多用一个街区外号或一句首尔口头禅，不要列举。</w:t>
+        <w:t>【个体差异】在江南长大的人、从全罗道来首尔读大学的人、住在京畿道每天通勤的人，知道的首尔不一样。按角色卡的出身和住处取用。</w:t>
+      </w:r>
+    </w:p>
+    <w:p>
+      <w:r>
+        <w:t>&lt;/kr_local_seoul&gt;</w:t>
       </w:r>
     </w:p>
     <w:p/>
     <w:p>
       <w:r>
-        <w:t>【街区外号：本地人随口这么叫】</w:t>
-      </w:r>
-    </w:p>
-    <w:p>
-      <w:r>
-        <w:t>- 연트럴파크＝延南洞的京义线林荫道（废铁路改成的公园），名字模仿纽约中央公园。草坪野餐、二十多岁的人多。</w:t>
-      </w:r>
-    </w:p>
-    <w:p>
-      <w:r>
-        <w:t>- 망리단길＝望远洞。生活感的小街，望远市场和小咖啡店，走路就能到望远汉江公园。</w:t>
-      </w:r>
-    </w:p>
-    <w:p>
-      <w:r>
-        <w:t>- "〜리단길"已经成了"网红小街"的通用后缀：송리단길（石村湖附近，约会商圈）、해리단길（釜山海云台）等。</w:t>
-      </w:r>
-    </w:p>
-    <w:p>
-      <w:r>
-        <w:t>- 힙지로＝乙支路三四街。印刷厂和五金店楼上没有招牌的酒吧，加上老街的生啤胡同（노가리골목）。部分老店因再开发被拆。</w:t>
-      </w:r>
-    </w:p>
-    <w:p>
-      <w:r>
-        <w:t>- 성수＝圣水洞。"首尔的布鲁克林"、"快闪店圣地"：品牌快闪店每周轮换，工厂改造的咖啡店，周末排队。房租暴涨，"绅士化"（젠트리피케이션）是常见话题。</w:t>
-      </w:r>
-    </w:p>
-    <w:p>
-      <w:r>
-        <w:t>- 익선동：韩屋小巷，复古风，约会和穿韩服拍照，很商业化。</w:t>
-      </w:r>
-    </w:p>
-    <w:p>
-      <w:r>
-        <w:t>- 서촌：景福宫西边，书店、画廊、通仁市场，安静文艺。（北村游客太多，已有限制通行时间。）</w:t>
-      </w:r>
-    </w:p>
-    <w:p>
-      <w:r>
-        <w:t>- 문래동：铁工厂和艺术家工作室混在一起。</w:t>
-      </w:r>
-    </w:p>
-    <w:p>
-      <w:r>
-        <w:t>- 한남동：有钱人住、时尚旗舰店、高价餐厅。</w:t>
-      </w:r>
-    </w:p>
-    <w:p>
-      <w:r>
-        <w:t>- 힙당동＝新堂洞。原本是辣炒年糕一条街，近年中央市场里的复古小酒馆火了。</w:t>
-      </w:r>
-    </w:p>
-    <w:p>
-      <w:r>
-        <w:t>- 가로수길：曾经最潮，2025年空置率四成多，被叫作"幽灵胡同"。角色提起它会带一点"那地方已经不行了"的语气。</w:t>
-      </w:r>
-    </w:p>
-    <w:p>
-      <w:r>
-        <w:t>- 압구정로데오：衰落过又重新热起来，年轻品牌回来了。</w:t>
-      </w:r>
-    </w:p>
-    <w:p>
-      <w:r>
-        <w:t>- 이태원：外国风格的街区。2022年万圣节踩踏事故（10.29）后，那条小巷成了纪念的路。很多人提到「그날」会沉默，万圣节会避开人多的地方。角色提起时要慎重。</w:t>
+        <w:t>═════ 釜山本地地名、说话方式、饮食文化by鲷鱼烧.docx ═════</w:t>
+      </w:r>
+    </w:p>
+    <w:p>
+      <w:r>
+        <w:t>&lt;kr_local_busan&gt;</w:t>
+      </w:r>
+    </w:p>
+    <w:p>
+      <w:r>
+        <w:t>用途：给釜山（及庆尚道）角色提供本地叫法、方言和饮食习惯。方言的准确是本篇重点；地名一次回复最多带一个。</w:t>
       </w:r>
     </w:p>
     <w:p/>
     <w:p>
       <w:r>
-        <w:t>【用地铁和出口定位】</w:t>
-      </w:r>
-    </w:p>
-    <w:p>
-      <w:r>
-        <w:t>- 问怎么来：「몇 호선 타?」。2号线是绿色环线；9号线急行在早高峰被叫作"地狱铁"（지옥철）；新盆唐线票价单独计算，连着江南和板桥（IT公司多）。</w:t>
-      </w:r>
-    </w:p>
-    <w:p>
-      <w:r>
-        <w:t>- 约见面说站名＋出口号：「강남역 11번 출구에서 봐」。出口号说错能差一个街区。</w:t>
-      </w:r>
-    </w:p>
-    <w:p>
-      <w:r>
-        <w:t>- 京畿道民的口头禅：「막차 끊기기 전에 가야 돼」（得在末班车停之前走）、「경기도민 왕복 3시간」。坐红色广域巴士（빨간버스），满员了站着不让上。GTX-A开通后，从坡州运井到首尔站约20分钟。</w:t>
-      </w:r>
-    </w:p>
-    <w:p>
-      <w:r>
-        <w:t>- 江南和江北是阶层标签："江南8学群"、"大峙洞补习班一条街"。"마용성"（麻浦・龙山・城东）是新晋的高房价区。</w:t>
+        <w:t>【地方】</w:t>
+      </w:r>
+    </w:p>
+    <w:p>
+      <w:r>
+        <w:t>- 서면：市中心，1号线和2号线换乘站。「서면에서 보자」是默认的约见地点，具体约在百货店门口。旁边的田浦咖啡街是旧工具街改造的。</w:t>
+      </w:r>
+    </w:p>
+    <w:p>
+      <w:r>
+        <w:t>- 해운대：海水浴场、高层豪宅、外地游客多。旧海云台站后面的小街叫「해리단길」。</w:t>
+      </w:r>
+    </w:p>
+    <w:p>
+      <w:r>
+        <w:t>- 광안리：本地年轻人更喜欢这里，看广安大桥夜景。每周六晚上有无人机灯光秀（约十分钟，免费）；秋天有釜山烟花节。</w:t>
+      </w:r>
+    </w:p>
+    <w:p>
+      <w:r>
+        <w:t>- 남포동・BIFF광장：种子糖饼的发源地，旁边是札嘎其鱼市和国际市场。</w:t>
+      </w:r>
+    </w:p>
+    <w:p>
+      <w:r>
+        <w:t>- 영도 흰여울문화마을：海边悬崖上的小村。</w:t>
+      </w:r>
+    </w:p>
+    <w:p>
+      <w:r>
+        <w:t>- 기장：大螃蟹、海东龙宫寺。</w:t>
+      </w:r>
+    </w:p>
+    <w:p>
+      <w:r>
+        <w:t>- 부산대 앞：学生街，便宜的衣服和吃的。</w:t>
+      </w:r>
+    </w:p>
+    <w:p>
+      <w:r>
+        <w:t>- 交通：地铁1〜4号线、东海线（到蔚山）。坡多，本地人会说「버스 타면 더 빨라」。</w:t>
       </w:r>
     </w:p>
     <w:p/>
     <w:p>
       <w:r>
-        <w:t>【吃喝】</w:t>
-      </w:r>
-    </w:p>
-    <w:p>
-      <w:r>
-        <w:t>- 广藏市场：绿豆煎饼、"麻药紫菜包饭"、生拌牛肉。游客多，2023年因宰客被骂过。</w:t>
-      </w:r>
-    </w:p>
-    <w:p>
-      <w:r>
-        <w:t>- 乙支路노가리골목：塑料椅子摆上街，生啤配明太鱼干，下班族聚集。</w:t>
-      </w:r>
-    </w:p>
-    <w:p>
-      <w:r>
-        <w:t>- 한강라면：在汉江公园的便利店用自动煮面机煮泡面，配外卖送来的炸鸡啤酒（치맥）。</w:t>
-      </w:r>
-    </w:p>
-    <w:p>
-      <w:r>
-        <w:t>- 포차：路边帐篷酒摊（越来越少）和室内酒摊（실내포차）。</w:t>
-      </w:r>
-    </w:p>
-    <w:p>
-      <w:r>
-        <w:t>- 喝酒的习惯：「1차, 2차, 3차」一场接一场；소맥＝烧酒兑啤酒，有人讲究比例；聚餐开始有人说祝酒词（건배사）；给年长者倒酒要双手，自己喝的时候侧过脸。</w:t>
+        <w:t>【吃】</w:t>
+      </w:r>
+    </w:p>
+    <w:p>
+      <w:r>
+        <w:t>- 돼지국밥：猪肉汤饭。自己加韭菜（釜山话叫정구지）和虾酱调味。西面和凡一洞有汤饭一条街。</w:t>
+      </w:r>
+    </w:p>
+    <w:p>
+      <w:r>
+        <w:t>- 밀면：战争避难时期诞生的冷面，分水的和拌的。</w:t>
+      </w:r>
+    </w:p>
+    <w:p>
+      <w:r>
+        <w:t>- 어묵：鱼饼，三进鱼饼等老字号。</w:t>
+      </w:r>
+    </w:p>
+    <w:p>
+      <w:r>
+        <w:t>- 씨앗호떡：塞满坚果和种子的糖饼。</w:t>
+      </w:r>
+    </w:p>
+    <w:p>
+      <w:r>
+        <w:t>- 낙곱새：章鱼＋牛小肠＋虾的炒锅。</w:t>
+      </w:r>
+    </w:p>
+    <w:p>
+      <w:r>
+        <w:t>- 꼼장어：盲鳗，烤的或调味炒的，札嘎其一带。</w:t>
+      </w:r>
+    </w:p>
+    <w:p>
+      <w:r>
+        <w:t>- 烧酒：本地品牌「대선」和「C1」，点酒时说「대선 주이소」。也有人只喝참이슬，会被老一辈说两句。</w:t>
       </w:r>
     </w:p>
     <w:p/>
     <w:p>
       <w:r>
-        <w:t>【首尔口语：放进台词，不加解释】</w:t>
-      </w:r>
-    </w:p>
-    <w:p>
-      <w:r>
-        <w:t>- 「〜거든」：解释原因或先摆出前提。「나 오늘 야근이거든」。</w:t>
-      </w:r>
-    </w:p>
-    <w:p>
-      <w:r>
-        <w:t>- 「〜잖아」：你明明知道的。「내가 말했잖아」。</w:t>
-      </w:r>
-    </w:p>
-    <w:p>
-      <w:r>
-        <w:t>- 句尾上扬：疑问只靠语调，不用"〜나/〜노"。年轻人撒娇时会说「했어용」「몰라용」。</w:t>
-      </w:r>
-    </w:p>
-    <w:p>
-      <w:r>
-        <w:t>- 年轻人的缩略语：「ㄹㅇ」（真的）、「ㅇㅈ」（认同）、「킹받네」（气死）、「갓생」（努力自律地生活）、「찐」（真正的）、「〜각」（看样子要……）。「헐」「대박」还在用，但年轻人听来有点老派。</w:t>
-      </w:r>
-    </w:p>
-    <w:p>
-      <w:r>
-        <w:t>- 用新词时符合角色年龄：三十多岁的人说十几岁的流行语会显得刻意。</w:t>
+        <w:t>【釜山方言：写台词时直接用，括号里是对应标准语，不要在回复里加注释】</w:t>
+      </w:r>
+    </w:p>
+    <w:p>
+      <w:r>
+        <w:t>- 疑问句尾分两种，外地人最容易弄错：</w:t>
+      </w:r>
+    </w:p>
+    <w:p>
+      <w:r>
+        <w:t xml:space="preserve">  能用"是／不是"回答的用〜나：「밥 뭇나?」（밥 먹었어?）「니 갈끼가?」</w:t>
+      </w:r>
+    </w:p>
+    <w:p>
+      <w:r>
+        <w:t xml:space="preserve">  带疑问词（뭐、어디、와、누）的用〜노：「뭐 하노?」（뭐 해?）「어디 가노?」「와 이라노?」（왜 이래?）</w:t>
+      </w:r>
+    </w:p>
+    <w:p>
+      <w:r>
+        <w:t>- 常用词：</w:t>
+      </w:r>
+    </w:p>
+    <w:p>
+      <w:r>
+        <w:t xml:space="preserve">  머라카노（뭐라고 하는 거야，你说啥／搞什么）｜단디 해라（똑바로 해，认真点、小心）｜억수로（매우）｜쫌（좀，也表示"拜托"）</w:t>
+      </w:r>
+    </w:p>
+    <w:p>
+      <w:r>
+        <w:t xml:space="preserve">  마!（喂！对男性的称呼或责备：「마, 니 뭐하노」）｜아이가（아니야?／맞잖아：「우리가 남이가」）｜〜다 아이가（〜잖아：「내 말 맞다 아이가」）</w:t>
+      </w:r>
+    </w:p>
+    <w:p>
+      <w:r>
+        <w:t xml:space="preserve">  맞나（그래?，附和）｜고마해라（그만해）｜쪼매（조금）｜니／내（너／나）｜기가（거야：「그기가?」）｜와（왜）｜머꼬（뭐야）</w:t>
+      </w:r>
+    </w:p>
+    <w:p>
+      <w:r>
+        <w:t xml:space="preserve">  敬语：〜예、아입니더（아닙니다）、맞십니더（맞습니다）</w:t>
+      </w:r>
+    </w:p>
+    <w:p>
+      <w:r>
+        <w:t>- 「가가 가가?」（그 애가 그 애야?）：靠音高区分意思，是方言的经典例子。</w:t>
+      </w:r>
+    </w:p>
+    <w:p>
+      <w:r>
+        <w:t>- 语调：快、冲、句尾下降，外地人听来像吵架，其实是普通聊天。</w:t>
       </w:r>
     </w:p>
     <w:p/>
     <w:p>
       <w:r>
+        <w:t>【大邱和庆南】</w:t>
+      </w:r>
+    </w:p>
+    <w:p>
+      <w:r>
+        <w:t>- 大邱：语气更硬更平，没有釜山那种"마!"和海边的味道。</w:t>
+      </w:r>
+    </w:p>
+    <w:p>
+      <w:r>
+        <w:t>- 庆南（昌原、晋州等）：口音偏内陆，敬语句尾〜예用得多。</w:t>
+      </w:r>
+    </w:p>
+    <w:p/>
+    <w:p>
+      <w:r>
+        <w:t>【切换规则】釜山角色在放松、激动、和家人朋友说话时用方言；在首尔职场开会时切成标准语，但语调藏不住（「억양은 못 숨긴다」）。喝了酒或生气时方言会回来。首尔人模仿釜山话常把〜나和〜노用错，被釜山人吐槽。</w:t>
+      </w:r>
+    </w:p>
+    <w:p/>
+    <w:p>
+      <w:r>
+        <w:t>【乐天巨人】主场社稷棒球场，合唱《부산갈매기》，头上套橙色塑料袋助威，对投手喊「마!」，界外球喊「아주라」（给小孩）。球迷自嘲「꼴데」（垫底乐天），每年都说「올해는 다르다」（今年不一样）。</w:t>
+      </w:r>
+    </w:p>
+    <w:p/>
+    <w:p>
+      <w:r>
         <w:t>【例句（只示范方向，换成角色自己的话）】</w:t>
       </w:r>
     </w:p>
     <w:p>
       <w:r>
-        <w:t>「연남동 갈래? 날씨 좋은데」「성수 팝업 줄 너무 길어」「나 9호선이라 일찍 나가야 돼」「강남역 11번 출구 앞이야」「한강 가서 라면 먹을래?」</w:t>
+        <w:t>「서면에서 보자, 롯데 앞에」「니 밥 뭇나?」「마, 와 이라노」「광안리 가서 드론쇼 볼래?」「국밥 한 그릇 하고 가라」</w:t>
+      </w:r>
+    </w:p>
+    <w:p>
+      <w:r>
+        <w:t>&lt;/kr_local_busan&gt;</w:t>
       </w:r>
     </w:p>
     <w:p/>
     <w:p>
       <w:r>
-        <w:t>【个体差异】在江南长大的人、从全罗道来首尔读大学的人、住在京畿道每天通勤的人，知道的首尔不一样。按角色卡的出身和住处取用。</w:t>
-      </w:r>
-    </w:p>
-    <w:p>
-      <w:r>
-        <w:t>&lt;/kr_local_seoul&gt;</w:t>
+        <w:t>═════ 光州本地地名、说话方式、饮食文化by鲷鱼烧.docx ═════</w:t>
+      </w:r>
+    </w:p>
+    <w:p>
+      <w:r>
+        <w:t>&lt;kr_local_gwangju&gt;</w:t>
+      </w:r>
+    </w:p>
+    <w:p>
+      <w:r>
+        <w:t>用途：给光州及全罗道角色提供本地叫法、方言和饮食习惯。方言的准确是本篇重点；地名一次回复最多带一个。</w:t>
       </w:r>
     </w:p>
     <w:p/>
     <w:p>
       <w:r>
-        <w:t>═════ 釜山本地地名、说话方式、饮食文化by鲷鱼烧.docx ═════</w:t>
-      </w:r>
-    </w:p>
-    <w:p>
-      <w:r>
-        <w:t>&lt;kr_local_busan&gt;</w:t>
-      </w:r>
-    </w:p>
-    <w:p>
-      <w:r>
-        <w:t>用途：给釜山（及庆尚道）角色提供本地叫法、方言和饮食习惯。方言的准确是本篇重点；地名一次回复最多带一个。</w:t>
+        <w:t>【光州的地方】</w:t>
+      </w:r>
+    </w:p>
+    <w:p>
+      <w:r>
+        <w:t>- 충장로：传统市中心商圈，旁边是旧全南道厅和国立亚洲文化殿堂（ACC）。</w:t>
+      </w:r>
+    </w:p>
+    <w:p>
+      <w:r>
+        <w:t>- 동명동 카페거리：年轻人约会和喝咖啡的地方。</w:t>
+      </w:r>
+    </w:p>
+    <w:p>
+      <w:r>
+        <w:t>- 양림동：近代传教士建筑和企鹅村（펭귄마을），复古拍照点。</w:t>
+      </w:r>
+    </w:p>
+    <w:p>
+      <w:r>
+        <w:t>- 1913송정역시장：KTX光州松亭站前改造过的传统市场，吃松亭牛肉饼（떡갈비）。</w:t>
+      </w:r>
+    </w:p>
+    <w:p>
+      <w:r>
+        <w:t>- 상무지구：新市中心，政府机关、酒吧、夜生活。</w:t>
+      </w:r>
+    </w:p>
+    <w:p>
+      <w:r>
+        <w:t>- 첨단지구：北部的产业园和住宅区。</w:t>
+      </w:r>
+    </w:p>
+    <w:p>
+      <w:r>
+        <w:t>- 무등산：光州人的精神象征，周末爬山。</w:t>
+      </w:r>
+    </w:p>
+    <w:p>
+      <w:r>
+        <w:t>- 地铁只有1号线，2号线一直在修（预计2028年开通），施工路段堵车是日常抱怨。</w:t>
       </w:r>
     </w:p>
     <w:p/>
     <w:p>
       <w:r>
-        <w:t>【地方】</w:t>
-      </w:r>
-    </w:p>
-    <w:p>
-      <w:r>
-        <w:t>- 서면：市中心，1号线和2号线换乘站。「서면에서 보자」是默认的约见地点，具体约在百货店门口。旁边的田浦咖啡街是旧工具街改造的。</w:t>
-      </w:r>
-    </w:p>
-    <w:p>
-      <w:r>
-        <w:t>- 해운대：海水浴场、高层豪宅、外地游客多。旧海云台站后面的小街叫「해리단길」。</w:t>
-      </w:r>
-    </w:p>
-    <w:p>
-      <w:r>
-        <w:t>- 광안리：本地年轻人更喜欢这里，看广安大桥夜景。每周六晚上有无人机灯光秀（约十分钟，免费）；秋天有釜山烟花节。</w:t>
-      </w:r>
-    </w:p>
-    <w:p>
-      <w:r>
-        <w:t>- 남포동・BIFF광장：种子糖饼的发源地，旁边是札嘎其鱼市和国际市场。</w:t>
-      </w:r>
-    </w:p>
-    <w:p>
-      <w:r>
-        <w:t>- 영도 흰여울문화마을：海边悬崖上的小村。</w:t>
-      </w:r>
-    </w:p>
-    <w:p>
-      <w:r>
-        <w:t>- 기장：大螃蟹、海东龙宫寺。</w:t>
-      </w:r>
-    </w:p>
-    <w:p>
-      <w:r>
-        <w:t>- 부산대 앞：学生街，便宜的衣服和吃的。</w:t>
-      </w:r>
-    </w:p>
-    <w:p>
-      <w:r>
-        <w:t>- 交通：地铁1〜4号线、东海线（到蔚山）。坡多，本地人会说「버스 타면 더 빨라」。</w:t>
+        <w:t>【全罗道其他地方】</w:t>
+      </w:r>
+    </w:p>
+    <w:p>
+      <w:r>
+        <w:t>全州：韩屋村、客舍附近的小街（객리단길）、南部市场的青年商场和周末夜市｜丽水：夜景、海边的浪漫酒摊（낭만포차）｜顺天：顺天湾芦苇和日落｜木浦：港口和近代街区</w:t>
       </w:r>
     </w:p>
     <w:p/>
@@ -2966,58 +3737,53 @@
     </w:p>
     <w:p>
       <w:r>
-        <w:t>- 돼지국밥：猪肉汤饭。自己加韭菜（釜山话叫정구지）和虾酱调味。西面和凡一洞有汤饭一条街。</w:t>
-      </w:r>
-    </w:p>
-    <w:p>
-      <w:r>
-        <w:t>- 밀면：战争避难时期诞生的冷面，分水的和拌的。</w:t>
-      </w:r>
-    </w:p>
-    <w:p>
-      <w:r>
-        <w:t>- 어묵：鱼饼，三进鱼饼等老字号。</w:t>
-      </w:r>
-    </w:p>
-    <w:p>
-      <w:r>
-        <w:t>- 씨앗호떡：塞满坚果和种子的糖饼。</w:t>
-      </w:r>
-    </w:p>
-    <w:p>
-      <w:r>
-        <w:t>- 낙곱새：章鱼＋牛小肠＋虾的炒锅。</w:t>
-      </w:r>
-    </w:p>
-    <w:p>
-      <w:r>
-        <w:t>- 꼼장어：盲鳗，烤的或调味炒的，札嘎其一带。</w:t>
-      </w:r>
-    </w:p>
-    <w:p>
-      <w:r>
-        <w:t>- 烧酒：本地品牌「대선」和「C1」，点酒时说「대선 주이소」。也有人只喝참이슬，会被老一辈说两句。</w:t>
+        <w:t>- 한정식：小菜摆满整桌（「상다리 휘어진다」）。</w:t>
+      </w:r>
+    </w:p>
+    <w:p>
+      <w:r>
+        <w:t>- 홍어삼합：发酵斑鳐配猪肉和泡菜，味道刺鼻，宴席必备。注意：「홍어」在网上也被用作贬低全罗道人的蔑称，角色听到外地人拿它开玩笑时会有反应。</w:t>
+      </w:r>
+    </w:p>
+    <w:p>
+      <w:r>
+        <w:t>- 떡갈비（松亭）、오리탕（柳洞鸭汤，加紫苏籽，浓稠）、육전（牛肉煎饼）。</w:t>
+      </w:r>
+    </w:p>
+    <w:p>
+      <w:r>
+        <w:t>- 상추튀김：光州特有，用生菜包炸物，蘸酱油洋葱汁。</w:t>
+      </w:r>
+    </w:p>
+    <w:p>
+      <w:r>
+        <w:t>- 全州：拌饭、黄豆芽汤饭配母酒（모주）、가맥（在小卖部喝啤酒配黄太鱼干）。</w:t>
+      </w:r>
+    </w:p>
+    <w:p>
+      <w:r>
+        <w:t>- 筏桥泥蚶（꼬막）、木浦小章鱼、丽水芥菜泡菜和酱蟹。</w:t>
+      </w:r>
+    </w:p>
+    <w:p>
+      <w:r>
+        <w:t>- 本地烧酒：잎새주（宝海酿造，总部在木浦）。</w:t>
       </w:r>
     </w:p>
     <w:p/>
     <w:p>
       <w:r>
-        <w:t>【釜山方言：写台词时直接用，括号里是对应标准语，不要在回复里加注释】</w:t>
-      </w:r>
-    </w:p>
-    <w:p>
-      <w:r>
-        <w:t>- 疑问句尾分两种，外地人最容易弄错：</w:t>
-      </w:r>
-    </w:p>
-    <w:p>
-      <w:r>
-        <w:t xml:space="preserve">  能用"是／不是"回答的用〜나：「밥 뭇나?」（밥 먹었어?）「니 갈끼가?」</w:t>
-      </w:r>
-    </w:p>
-    <w:p>
-      <w:r>
-        <w:t xml:space="preserve">  带疑问词（뭐、어디、와、누）的用〜노：「뭐 하노?」（뭐 해?）「어디 가노?」「와 이라노?」（왜 이래?）</w:t>
+        <w:t>【全罗道方言：写台词时直接用，括号里是对应标准语，不要在回复里加注释】</w:t>
+      </w:r>
+    </w:p>
+    <w:p>
+      <w:r>
+        <w:t>- 句尾：</w:t>
+      </w:r>
+    </w:p>
+    <w:p>
+      <w:r>
+        <w:t xml:space="preserve">  〜잉（软化、撒娇：「밥 묵었어잉?」）｜〜당께／〜랑께（强调"我都说了"：「내가 했당께!」）｜〜제（确认：「그라제」＝그렇지）｜〜냐（疑问，比首尔话直接：「뭣하냐?」＝뭐 해?）｜〜부러／〜불다（＝〜버리다：「해부러」「가부러」「묵어부러」）</w:t>
       </w:r>
     </w:p>
     <w:p>
@@ -3027,76 +3793,39 @@
     </w:p>
     <w:p>
       <w:r>
-        <w:t xml:space="preserve">  머라카노（뭐라고 하는 거야，你说啥／搞什么）｜단디 해라（똑바로 해，认真点、小心）｜억수로（매우）｜쫌（좀，也表示"拜托"）</w:t>
-      </w:r>
-    </w:p>
-    <w:p>
-      <w:r>
-        <w:t xml:space="preserve">  마!（喂！对男性的称呼或责备：「마, 니 뭐하노」）｜아이가（아니야?／맞잖아：「우리가 남이가」）｜〜다 아이가（〜잖아：「내 말 맞다 아이가」）</w:t>
-      </w:r>
-    </w:p>
-    <w:p>
-      <w:r>
-        <w:t xml:space="preserve">  맞나（그래?，附和）｜고마해라（그만해）｜쪼매（조금）｜니／내（너／나）｜기가（거야：「그기가?」）｜와（왜）｜머꼬（뭐야）</w:t>
-      </w:r>
-    </w:p>
-    <w:p>
-      <w:r>
-        <w:t xml:space="preserve">  敬语：〜예、아입니더（아닙니다）、맞십니더（맞습니다）</w:t>
-      </w:r>
-    </w:p>
-    <w:p>
-      <w:r>
-        <w:t>- 「가가 가가?」（그 애가 그 애야?）：靠音高区分意思，是方言的经典例子。</w:t>
-      </w:r>
-    </w:p>
-    <w:p>
-      <w:r>
-        <w:t>- 语调：快、冲、句尾下降，外地人听来像吵架，其实是普通聊天。</w:t>
+        <w:t xml:space="preserve">  거시기（万能指代词，想不起来或不好说时用：「거시기 해부러」）｜허벌나게／겁나／징하게（非常；징하다也有"烦人、够呛"的意思）｜워메／오메（惊叹：「오메, 징한그」）｜아따（不耐烦或感叹）｜오지다（真棒、满满的）｜싸게싸게（빨리빨리）｜쪼까（조금）｜개미（滋味）｜깨복쟁이 친구（光屁股一起长大的发小）｜잡것（混账东西，熟人之间的亲昵骂法）｜나가（내가）｜여그／거그（여기／거기）｜긍께（그러니까）｜묵다（먹다）</w:t>
+      </w:r>
+    </w:p>
+    <w:p>
+      <w:r>
+        <w:t>- 语调：句尾上扬、拉长，比庆尚道柔和，但语速快、感情外露。</w:t>
+      </w:r>
+    </w:p>
+    <w:p>
+      <w:r>
+        <w:t>- 地区差异：光州是城市型，年轻人只带一点语调；全南西部（木浦、海南）最浓；全南东部（丽水、顺天）带一点庆尚道味；全北（全州）接近忠清，常用「〜잉」「겁나」。</w:t>
       </w:r>
     </w:p>
     <w:p/>
     <w:p>
       <w:r>
-        <w:t>【大邱和庆南】</w:t>
-      </w:r>
-    </w:p>
-    <w:p>
-      <w:r>
-        <w:t>- 大邱：语气更硬更平，没有釜山那种"마!"和海边的味道。</w:t>
-      </w:r>
-    </w:p>
-    <w:p>
-      <w:r>
-        <w:t>- 庆南（昌原、晋州等）：口音偏内陆，敬语句尾〜예用得多。</w:t>
+        <w:t>【切换规则】全罗道角色在放松、激动、和家人发小说话时用方言；在首尔职场切成标准语。有人因为担心偏见而刻意隐藏口音，有人坦然地说。喝了酒、生气或打电话回家时方言会回来。</w:t>
       </w:r>
     </w:p>
     <w:p/>
     <w:p>
       <w:r>
-        <w:t>【切换规则】釜山角色在放松、激动、和家人朋友说话时用方言；在首尔职场开会时切成标准语，但语调藏不住（「억양은 못 숨긴다」）。喝了酒或生气时方言会回来。首尔人模仿釜山话常把〜나和〜노用错，被釜山人吐槽。</w:t>
-      </w:r>
-    </w:p>
-    <w:p/>
-    <w:p>
-      <w:r>
-        <w:t>【乐天巨人】主场社稷棒球场，合唱《부산갈매기》，头上套橙色塑料袋助威，对投手喊「마!」，界外球喊「아주라」（给小孩）。球迷自嘲「꼴데」（垫底乐天），每年都说「올해는 다르다」（今年不一样）。</w:t>
-      </w:r>
-    </w:p>
-    <w:p/>
-    <w:p>
-      <w:r>
         <w:t>【例句（只示范方向，换成角色自己的话）】</w:t>
       </w:r>
     </w:p>
     <w:p>
       <w:r>
-        <w:t>「서면에서 보자, 롯데 앞에」「니 밥 뭇나?」「마, 와 이라노」「광안리 가서 드론쇼 볼래?」「국밥 한 그릇 하고 가라」</w:t>
-      </w:r>
-    </w:p>
-    <w:p>
-      <w:r>
-        <w:t>&lt;/kr_local_busan&gt;</w:t>
+        <w:t>「밥 묵었어잉?」「오메, 징한그」「싸게싸게 와부러」「거시기, 그거 있잖애」「동명동 가서 커피 한잔 할래?」「여그 떡갈비는 진짜 개미가 있당께」</w:t>
+      </w:r>
+    </w:p>
+    <w:p>
+      <w:r>
+        <w:t>&lt;/kr_local_gwangju&gt;</w:t>
       </w:r>
     </w:p>
     <w:p/>

</xml_diff>